<commit_message>
docs: add live production URL https://v-monitor.vercel.app/ across docs and READMEs
</commit_message>
<xml_diff>
--- a/V_Monitor_Project_Overview.docx
+++ b/V_Monitor_Project_Overview.docx
@@ -2,7 +2,7 @@
 <file path=word/document.xml><?xml version="1.0" encoding="utf-8"?>
 <w:document xmlns:w="http://schemas.openxmlformats.org/wordprocessingml/2006/main" xmlns:m="http://schemas.openxmlformats.org/officeDocument/2006/math" xmlns:r="http://schemas.openxmlformats.org/officeDocument/2006/relationships" xmlns:o="urn:schemas-microsoft-com:office:office" xmlns:v="urn:schemas-microsoft-com:vml" xmlns:w10="urn:schemas-microsoft-com:office:word" xmlns:a="http://schemas.openxmlformats.org/drawingml/2006/main" xmlns:pic="http://schemas.openxmlformats.org/drawingml/2006/picture" xmlns:wp="http://schemas.openxmlformats.org/drawingml/2006/wordprocessingDrawing">
   <w:body>
-    <w:bookmarkStart w:id="22" w:name="X03b8523434e42f6bfab640e397267619c0e7a0a"/>
+    <w:bookmarkStart w:id="23" w:name="X03b8523434e42f6bfab640e397267619c0e7a0a"/>
     <w:p>
       <w:pPr>
         <w:pStyle w:val="Heading1"/>
@@ -11,31 +11,39 @@
         <w:t xml:space="preserve">V-Monitor (IntelliLink OS): Sovereign Carrier-Grade SD-WAN &amp; AI-NOC Platform</w:t>
       </w:r>
     </w:p>
-    <w:bookmarkStart w:id="10" w:name="executive-overview"/>
-    <w:p>
-      <w:pPr>
-        <w:pStyle w:val="Heading2"/>
-      </w:pPr>
-      <w:r>
-        <w:t xml:space="preserve">1. Executive Overview</w:t>
-      </w:r>
-    </w:p>
-    <w:p>
-      <w:pPr>
-        <w:pStyle w:val="FirstParagraph"/>
-      </w:pPr>
+    <w:p>
+      <w:pPr>
+        <w:pStyle w:val="BlockText"/>
+      </w:pPr>
+      <w:r>
+        <w:t xml:space="preserve">🌐</w:t>
+      </w:r>
+      <w:r>
+        <w:t xml:space="preserve"> </w:t>
+      </w:r>
       <w:r>
         <w:rPr>
           <w:b/>
           <w:bCs/>
         </w:rPr>
-        <w:t xml:space="preserve">V-Monitor (IntelliLink OS)</w:t>
-      </w:r>
-      <w:r>
-        <w:t xml:space="preserve"> </w:t>
-      </w:r>
-      <w:r>
-        <w:t xml:space="preserve">is a sovereign, carrier-grade</w:t>
+        <w:t xml:space="preserve">Live Cloud NOC:</w:t>
+      </w:r>
+      <w:r>
+        <w:t xml:space="preserve"> </w:t>
+      </w:r>
+      <w:hyperlink r:id="rId9">
+        <w:r>
+          <w:rPr>
+            <w:rStyle w:val="Hyperlink"/>
+          </w:rPr>
+          <w:t xml:space="preserve">https://v-monitor.vercel.app/</w:t>
+        </w:r>
+      </w:hyperlink>
+      <w:r>
+        <w:br/>
+      </w:r>
+      <w:r>
+        <w:t xml:space="preserve">🛡️</w:t>
       </w:r>
       <w:r>
         <w:t xml:space="preserve"> </w:t>
@@ -45,10 +53,24 @@
           <w:b/>
           <w:bCs/>
         </w:rPr>
-        <w:t xml:space="preserve">Software-Defined Wide Area Network (SD-WAN)</w:t>
-      </w:r>
-      <w:r>
-        <w:t xml:space="preserve">,</w:t>
+        <w:t xml:space="preserve">AI Compliance Hub:</w:t>
+      </w:r>
+      <w:r>
+        <w:t xml:space="preserve"> </w:t>
+      </w:r>
+      <w:hyperlink r:id="rId10">
+        <w:r>
+          <w:rPr>
+            <w:rStyle w:val="Hyperlink"/>
+          </w:rPr>
+          <w:t xml:space="preserve">https://ai-compliance-web-five.vercel.app/</w:t>
+        </w:r>
+      </w:hyperlink>
+      <w:r>
+        <w:br/>
+      </w:r>
+      <w:r>
+        <w:t xml:space="preserve">🔑</w:t>
       </w:r>
       <w:r>
         <w:t xml:space="preserve"> </w:t>
@@ -58,19 +80,93 @@
           <w:b/>
           <w:bCs/>
         </w:rPr>
-        <w:t xml:space="preserve">Secure Access Service Edge (SASE)</w:t>
-      </w:r>
-      <w:r>
-        <w:t xml:space="preserve">, and</w:t>
-      </w:r>
-      <w:r>
-        <w:t xml:space="preserve"> </w:t>
-      </w:r>
+        <w:t xml:space="preserve">Demo Credentials:</w:t>
+      </w:r>
+      <w:r>
+        <w:t xml:space="preserve"> </w:t>
+      </w:r>
+      <w:r>
+        <w:rPr>
+          <w:rStyle w:val="VerbatimChar"/>
+        </w:rPr>
+        <w:t xml:space="preserve">admin@intellilink.media</w:t>
+      </w:r>
+      <w:r>
+        <w:t xml:space="preserve"> </w:t>
+      </w:r>
+      <w:r>
+        <w:t xml:space="preserve">/</w:t>
+      </w:r>
+      <w:r>
+        <w:t xml:space="preserve"> </w:t>
+      </w:r>
+      <w:r>
+        <w:rPr>
+          <w:rStyle w:val="VerbatimChar"/>
+        </w:rPr>
+        <w:t xml:space="preserve">IntelliLink@2026</w:t>
+      </w:r>
+    </w:p>
+    <w:bookmarkStart w:id="12" w:name="executive-overview"/>
+    <w:p>
+      <w:pPr>
+        <w:pStyle w:val="Heading2"/>
+      </w:pPr>
+      <w:r>
+        <w:t xml:space="preserve">1. Executive Overview</w:t>
+      </w:r>
+    </w:p>
+    <w:p>
+      <w:pPr>
+        <w:pStyle w:val="FirstParagraph"/>
+      </w:pPr>
       <w:r>
         <w:rPr>
           <w:b/>
           <w:bCs/>
         </w:rPr>
+        <w:t xml:space="preserve">V-Monitor (IntelliLink OS)</w:t>
+      </w:r>
+      <w:r>
+        <w:t xml:space="preserve"> </w:t>
+      </w:r>
+      <w:r>
+        <w:t xml:space="preserve">is a sovereign, carrier-grade</w:t>
+      </w:r>
+      <w:r>
+        <w:t xml:space="preserve"> </w:t>
+      </w:r>
+      <w:r>
+        <w:rPr>
+          <w:b/>
+          <w:bCs/>
+        </w:rPr>
+        <w:t xml:space="preserve">Software-Defined Wide Area Network (SD-WAN)</w:t>
+      </w:r>
+      <w:r>
+        <w:t xml:space="preserve">,</w:t>
+      </w:r>
+      <w:r>
+        <w:t xml:space="preserve"> </w:t>
+      </w:r>
+      <w:r>
+        <w:rPr>
+          <w:b/>
+          <w:bCs/>
+        </w:rPr>
+        <w:t xml:space="preserve">Secure Access Service Edge (SASE)</w:t>
+      </w:r>
+      <w:r>
+        <w:t xml:space="preserve">, and</w:t>
+      </w:r>
+      <w:r>
+        <w:t xml:space="preserve"> </w:t>
+      </w:r>
+      <w:r>
+        <w:rPr>
+          <w:b/>
+          <w:bCs/>
+        </w:rPr>
         <w:t xml:space="preserve">Autonomous Network Operations Center (A-NOC)</w:t>
       </w:r>
       <w:r>
@@ -80,7 +176,7 @@
         <w:t xml:space="preserve">orchestration fabric. Engineered for Tier-1 telecom carriers, banking conglomerates, defense enclaves, and distributed enterprises, V-Monitor bridges the gap between bare-metal edge hardware and cloud-native control plane governance.</w:t>
       </w:r>
     </w:p>
-    <w:bookmarkStart w:id="9" w:name="the-problem-it-solves"/>
+    <w:bookmarkStart w:id="11" w:name="the-problem-it-solves"/>
     <w:p>
       <w:pPr>
         <w:pStyle w:val="Heading3"/>
@@ -162,9 +258,9 @@
         </w:pict>
       </w:r>
     </w:p>
-    <w:bookmarkEnd w:id="9"/>
-    <w:bookmarkEnd w:id="10"/>
-    <w:bookmarkStart w:id="11" w:name="high-level-architecture"/>
+    <w:bookmarkEnd w:id="11"/>
+    <w:bookmarkEnd w:id="12"/>
+    <w:bookmarkStart w:id="13" w:name="high-level-architecture"/>
     <w:p>
       <w:pPr>
         <w:pStyle w:val="Heading2"/>
@@ -344,8 +440,8 @@
         </w:pict>
       </w:r>
     </w:p>
-    <w:bookmarkEnd w:id="11"/>
-    <w:bookmarkStart w:id="18" w:name="core-capabilities"/>
+    <w:bookmarkEnd w:id="13"/>
+    <w:bookmarkStart w:id="19" w:name="core-capabilities"/>
     <w:p>
       <w:pPr>
         <w:pStyle w:val="Heading2"/>
@@ -354,7 +450,7 @@
         <w:t xml:space="preserve">3. Core Capabilities</w:t>
       </w:r>
     </w:p>
-    <w:bookmarkStart w:id="12" w:name="Xaf471fbbb20238b2fc782942a27b78111463112"/>
+    <w:bookmarkStart w:id="14" w:name="Xaf471fbbb20238b2fc782942a27b78111463112"/>
     <w:p>
       <w:pPr>
         <w:pStyle w:val="Heading3"/>
@@ -432,8 +528,8 @@
         <w:t xml:space="preserve">, and displays actual hardware telemetry.</w:t>
       </w:r>
     </w:p>
-    <w:bookmarkEnd w:id="12"/>
-    <w:bookmarkStart w:id="13" w:name="sovereign-edge-mesh-multi-wan-bundling"/>
+    <w:bookmarkEnd w:id="14"/>
+    <w:bookmarkStart w:id="15" w:name="sovereign-edge-mesh-multi-wan-bundling"/>
     <w:p>
       <w:pPr>
         <w:pStyle w:val="Heading3"/>
@@ -523,8 +619,8 @@
         <w:t xml:space="preserve">profiles.</w:t>
       </w:r>
     </w:p>
-    <w:bookmarkEnd w:id="13"/>
-    <w:bookmarkStart w:id="14" w:name="autonomous-ai-noc-self-healing"/>
+    <w:bookmarkEnd w:id="15"/>
+    <w:bookmarkStart w:id="16" w:name="autonomous-ai-noc-self-healing"/>
     <w:p>
       <w:pPr>
         <w:pStyle w:val="Heading3"/>
@@ -625,8 +721,8 @@
         <w:t xml:space="preserve">: Clears stale kernel MAC tables directly on physical host interfaces.</w:t>
       </w:r>
     </w:p>
-    <w:bookmarkEnd w:id="14"/>
-    <w:bookmarkStart w:id="15" w:name="X64c05f3777aee276dec5a25f73084e74ff7619a"/>
+    <w:bookmarkEnd w:id="16"/>
+    <w:bookmarkStart w:id="17" w:name="X64c05f3777aee276dec5a25f73084e74ff7619a"/>
     <w:p>
       <w:pPr>
         <w:pStyle w:val="Heading3"/>
@@ -736,8 +832,8 @@
         <w:t xml:space="preserve">) directly on managed remote nodes.</w:t>
       </w:r>
     </w:p>
-    <w:bookmarkEnd w:id="15"/>
-    <w:bookmarkStart w:id="17" w:name="regulatory-ai-compliance-hub"/>
+    <w:bookmarkEnd w:id="17"/>
+    <w:bookmarkStart w:id="18" w:name="regulatory-ai-compliance-hub"/>
     <w:p>
       <w:pPr>
         <w:pStyle w:val="Heading3"/>
@@ -753,7 +849,7 @@
       <w:r>
         <w:t xml:space="preserve">Bidirectional integration with Cloud Production (</w:t>
       </w:r>
-      <w:hyperlink r:id="rId16">
+      <w:hyperlink r:id="rId10">
         <w:r>
           <w:rPr>
             <w:rStyle w:val="VerbatimChar"/>
@@ -838,9 +934,9 @@
         </w:pict>
       </w:r>
     </w:p>
-    <w:bookmarkEnd w:id="17"/>
     <w:bookmarkEnd w:id="18"/>
-    <w:bookmarkStart w:id="19" w:name="key-target-personas-use-cases"/>
+    <w:bookmarkEnd w:id="19"/>
+    <w:bookmarkStart w:id="20" w:name="key-target-personas-use-cases"/>
     <w:p>
       <w:pPr>
         <w:pStyle w:val="Heading2"/>
@@ -944,8 +1040,8 @@
         </w:pict>
       </w:r>
     </w:p>
-    <w:bookmarkEnd w:id="19"/>
-    <w:bookmarkStart w:id="20" w:name="technology-stack"/>
+    <w:bookmarkEnd w:id="20"/>
+    <w:bookmarkStart w:id="21" w:name="technology-stack"/>
     <w:p>
       <w:pPr>
         <w:pStyle w:val="Heading2"/>
@@ -1212,8 +1308,8 @@
         </w:pict>
       </w:r>
     </w:p>
-    <w:bookmarkEnd w:id="20"/>
-    <w:bookmarkStart w:id="21" w:name="quick-start-verification"/>
+    <w:bookmarkEnd w:id="21"/>
+    <w:bookmarkStart w:id="22" w:name="quick-start-verification"/>
     <w:p>
       <w:pPr>
         <w:pStyle w:val="Heading2"/>
@@ -1302,7 +1398,16 @@
         <w:rPr>
           <w:rStyle w:val="VerbatimChar"/>
         </w:rPr>
-        <w:t xml:space="preserve"># URL: http://localhost:3000 (or http://&lt;LAN_IP&gt;:3000)</w:t>
+        <w:t xml:space="preserve"># Live Cloud NOC: https://v-monitor.vercel.app/</w:t>
+      </w:r>
+      <w:r>
+        <w:br/>
+      </w:r>
+      <w:r>
+        <w:rPr>
+          <w:rStyle w:val="VerbatimChar"/>
+        </w:rPr>
+        <w:t xml:space="preserve"># Local URL: http://localhost:3000 (or http://&lt;LAN_IP&gt;:3000)</w:t>
       </w:r>
       <w:r>
         <w:br/>
@@ -1314,8 +1419,8 @@
         <w:t xml:space="preserve"># Credentials: admin@intellilink.media / IntelliLink@2026</w:t>
       </w:r>
     </w:p>
-    <w:bookmarkEnd w:id="21"/>
     <w:bookmarkEnd w:id="22"/>
+    <w:bookmarkEnd w:id="23"/>
     <w:sectPr>
       <w:footnotePr>
         <w:numRestart w:val="eachSect"/>

</xml_diff>

<commit_message>
docs: elevate telecommunications governance and regulatory compliance as central theme
</commit_message>
<xml_diff>
--- a/V_Monitor_Project_Overview.docx
+++ b/V_Monitor_Project_Overview.docx
@@ -2,13 +2,13 @@
 <file path=word/document.xml><?xml version="1.0" encoding="utf-8"?>
 <w:document xmlns:w="http://schemas.openxmlformats.org/wordprocessingml/2006/main" xmlns:m="http://schemas.openxmlformats.org/officeDocument/2006/math" xmlns:r="http://schemas.openxmlformats.org/officeDocument/2006/relationships" xmlns:o="urn:schemas-microsoft-com:office:office" xmlns:v="urn:schemas-microsoft-com:vml" xmlns:w10="urn:schemas-microsoft-com:office:word" xmlns:a="http://schemas.openxmlformats.org/drawingml/2006/main" xmlns:pic="http://schemas.openxmlformats.org/drawingml/2006/picture" xmlns:wp="http://schemas.openxmlformats.org/drawingml/2006/wordprocessingDrawing">
   <w:body>
-    <w:bookmarkStart w:id="23" w:name="X03b8523434e42f6bfab640e397267619c0e7a0a"/>
+    <w:bookmarkStart w:id="23" w:name="X393f4564ee8ca05c7f98c2d9e34f6d1ea187e49"/>
     <w:p>
       <w:pPr>
         <w:pStyle w:val="Heading1"/>
       </w:pPr>
       <w:r>
-        <w:t xml:space="preserve">V-Monitor (IntelliLink OS): Sovereign Carrier-Grade SD-WAN &amp; AI-NOC Platform</w:t>
+        <w:t xml:space="preserve">V-Monitor (IntelliLink OS): Sovereign SD-WAN, Network Governance &amp; AI-NOC Platform</w:t>
       </w:r>
     </w:p>
     <w:p>
@@ -154,7 +154,7 @@
           <w:b/>
           <w:bCs/>
         </w:rPr>
-        <w:t xml:space="preserve">Secure Access Service Edge (SASE)</w:t>
+        <w:t xml:space="preserve">Autonomous Network Operations Center (A-NOC)</w:t>
       </w:r>
       <w:r>
         <w:t xml:space="preserve">, and</w:t>
@@ -167,22 +167,19 @@
           <w:b/>
           <w:bCs/>
         </w:rPr>
-        <w:t xml:space="preserve">Autonomous Network Operations Center (A-NOC)</w:t>
-      </w:r>
-      <w:r>
-        <w:t xml:space="preserve"> </w:t>
-      </w:r>
-      <w:r>
-        <w:t xml:space="preserve">orchestration fabric. Engineered for Tier-1 telecom carriers, banking conglomerates, defense enclaves, and distributed enterprises, V-Monitor bridges the gap between bare-metal edge hardware and cloud-native control plane governance.</w:t>
-      </w:r>
-    </w:p>
-    <w:bookmarkStart w:id="11" w:name="the-problem-it-solves"/>
+        <w:t xml:space="preserve">Telecommunications Governance Platform (Intellilink NOG / ICG)</w:t>
+      </w:r>
+      <w:r>
+        <w:t xml:space="preserve">. Engineered for national regulatory authorities, Tier-1 telecom carriers, banking conglomerates, and sovereign defense enclaves, V-Monitor unites high-speed edge networking with strict regulatory compliance, lawful interception, and data sovereignty governance.</w:t>
+      </w:r>
+    </w:p>
+    <w:bookmarkStart w:id="11" w:name="core-problems-solved"/>
     <w:p>
       <w:pPr>
         <w:pStyle w:val="Heading3"/>
       </w:pPr>
       <w:r>
-        <w:t xml:space="preserve">The Problem It Solves:</w:t>
+        <w:t xml:space="preserve">Core Problems Solved:</w:t>
       </w:r>
     </w:p>
     <w:p>
@@ -198,13 +195,45 @@
           <w:b/>
           <w:bCs/>
         </w:rPr>
-        <w:t xml:space="preserve">Proprietary Vendor Lock-In:</w:t>
-      </w:r>
-      <w:r>
-        <w:t xml:space="preserve"> </w:t>
-      </w:r>
-      <w:r>
-        <w:t xml:space="preserve">Replaces expensive, closed-box networking hardware (Cisco, Fortinet, Juniper) with an open, high-performance Linux kernel-level architecture.</w:t>
+        <w:t xml:space="preserve">The Satellite Regulatory Dilemma:</w:t>
+      </w:r>
+      <w:r>
+        <w:t xml:space="preserve"> </w:t>
+      </w:r>
+      <w:r>
+        <w:t xml:space="preserve">Unregulated Low-Earth-Orbit (LEO) satellite links (e.g., Starlink) bypass national telecommunications jurisdictions. V-Monitor solves this by separating the</w:t>
+      </w:r>
+      <w:r>
+        <w:t xml:space="preserve"> </w:t>
+      </w:r>
+      <w:r>
+        <w:rPr>
+          <w:b/>
+          <w:bCs/>
+        </w:rPr>
+        <w:t xml:space="preserve">Transport Underlay</w:t>
+      </w:r>
+      <w:r>
+        <w:t xml:space="preserve"> </w:t>
+      </w:r>
+      <w:r>
+        <w:t xml:space="preserve">(satellite/cellular) from the</w:t>
+      </w:r>
+      <w:r>
+        <w:t xml:space="preserve"> </w:t>
+      </w:r>
+      <w:r>
+        <w:rPr>
+          <w:b/>
+          <w:bCs/>
+        </w:rPr>
+        <w:t xml:space="preserve">Governance Overlay</w:t>
+      </w:r>
+      <w:r>
+        <w:t xml:space="preserve"> </w:t>
+      </w:r>
+      <w:r>
+        <w:t xml:space="preserve">(licensed domestic ISP PoP breakout), guaranteeing national regulatory alignment.</w:t>
       </w:r>
     </w:p>
     <w:p>
@@ -220,13 +249,13 @@
           <w:b/>
           <w:bCs/>
         </w:rPr>
-        <w:t xml:space="preserve">Data Sovereignty Violations:</w:t>
-      </w:r>
-      <w:r>
-        <w:t xml:space="preserve"> </w:t>
-      </w:r>
-      <w:r>
-        <w:t xml:space="preserve">Enforces strict cryptographic isolation and zero-trust policies, ensuring sensitive enterprise payloads never traverse unauthorized sovereign borders.</w:t>
+        <w:t xml:space="preserve">Data Sovereignty Violations &amp; Border Leakage:</w:t>
+      </w:r>
+      <w:r>
+        <w:t xml:space="preserve"> </w:t>
+      </w:r>
+      <w:r>
+        <w:t xml:space="preserve">Prevents enterprise, government, and banking payloads from traversing foreign egress points, anchoring all traffic within sovereign national IP boundaries (e.g., AFRINIC/national address allocations).</w:t>
       </w:r>
     </w:p>
     <w:p>
@@ -242,13 +271,35 @@
           <w:b/>
           <w:bCs/>
         </w:rPr>
-        <w:t xml:space="preserve">Outage Latency &amp; Human Error:</w:t>
-      </w:r>
-      <w:r>
-        <w:t xml:space="preserve"> </w:t>
-      </w:r>
-      <w:r>
-        <w:t xml:space="preserve">Eliminates manual triage by leveraging sub-second Bidirectional Forwarding Detection (BFD) and automated AI remediation playbooks that mitigate circuit flaps in milliseconds.</w:t>
+        <w:t xml:space="preserve">Proprietary Vendor Lock-In:</w:t>
+      </w:r>
+      <w:r>
+        <w:t xml:space="preserve"> </w:t>
+      </w:r>
+      <w:r>
+        <w:t xml:space="preserve">Replaces expensive, closed-box networking hardware (Cisco, Fortinet, Juniper) with an open, high-performance Linux kernel-level architecture (Netlink, eBPF, WireGuard).</w:t>
+      </w:r>
+    </w:p>
+    <w:p>
+      <w:pPr>
+        <w:pStyle w:val="Compact"/>
+        <w:numPr>
+          <w:ilvl w:val="0"/>
+          <w:numId w:val="1001"/>
+        </w:numPr>
+      </w:pPr>
+      <w:r>
+        <w:rPr>
+          <w:b/>
+          <w:bCs/>
+        </w:rPr>
+        <w:t xml:space="preserve">Outage Latency &amp; Manual Triage:</w:t>
+      </w:r>
+      <w:r>
+        <w:t xml:space="preserve"> </w:t>
+      </w:r>
+      <w:r>
+        <w:t xml:space="preserve">Eliminates downtime with sub-second Bidirectional Forwarding Detection (BFD) and automated AI Root Cause Analysis (RCA) that mitigates circuit flaps in milliseconds.</w:t>
       </w:r>
     </w:p>
     <w:p>
@@ -260,13 +311,13 @@
     </w:p>
     <w:bookmarkEnd w:id="11"/>
     <w:bookmarkEnd w:id="12"/>
-    <w:bookmarkStart w:id="13" w:name="high-level-architecture"/>
+    <w:bookmarkStart w:id="13" w:name="Xe9742133071b6617b46c2a3eb5ecf3321ea10e8"/>
     <w:p>
       <w:pPr>
         <w:pStyle w:val="Heading2"/>
       </w:pPr>
       <w:r>
-        <w:t xml:space="preserve">2. High-Level Architecture</w:t>
+        <w:t xml:space="preserve">2. High-Level Architecture &amp; Governance Decoupling</w:t>
       </w:r>
     </w:p>
     <w:p>
@@ -286,7 +337,7 @@
         <w:rPr>
           <w:rStyle w:val="VerbatimChar"/>
         </w:rPr>
-        <w:t xml:space="preserve"> │                      V-MONITOR CONTROL PLANE                           │</w:t>
+        <w:t xml:space="preserve"> │            V-MONITOR REGULATORY &amp; CONTROL PLANE GOVERNANCE             │</w:t>
       </w:r>
       <w:r>
         <w:br/>
@@ -367,7 +418,7 @@
         <w:rPr>
           <w:rStyle w:val="VerbatimChar"/>
         </w:rPr>
-        <w:t xml:space="preserve"> │                  PERSISTENCE, CACHE &amp; STATE STORAGE                          │</w:t>
+        <w:t xml:space="preserve"> │               SOVEREIGN GOVERNANCE &amp; COMPLIANCE DATA PLANE                   │</w:t>
       </w:r>
       <w:r>
         <w:br/>
@@ -376,7 +427,7 @@
         <w:rPr>
           <w:rStyle w:val="VerbatimChar"/>
         </w:rPr>
-        <w:t xml:space="preserve"> │              MySQL 8.0 / PostgreSQL  •  Redis Pub/Sub  •  eBPF/ARP           │</w:t>
+        <w:t xml:space="preserve"> │     Lawful Intercept (ETSI) • Domestic PoP Anchoring • MySQL 8 • Redis       │</w:t>
       </w:r>
       <w:r>
         <w:br/>
@@ -412,7 +463,7 @@
         <w:rPr>
           <w:rStyle w:val="VerbatimChar"/>
         </w:rPr>
-        <w:t xml:space="preserve"> │                    EDGE MESH OVERLAY INFRASTRUCTURE                          │</w:t>
+        <w:t xml:space="preserve"> │                MULTI-ORBIT EDGE UNDERLAY &amp; OVERLAY FABRIC                    │</w:t>
       </w:r>
       <w:r>
         <w:br/>
@@ -450,92 +501,13 @@
         <w:t xml:space="preserve">3. Core Capabilities</w:t>
       </w:r>
     </w:p>
-    <w:bookmarkStart w:id="14" w:name="Xaf471fbbb20238b2fc782942a27b78111463112"/>
+    <w:bookmarkStart w:id="14" w:name="Xd2fbb44096df71e58988262a999761abe847fda"/>
     <w:p>
       <w:pPr>
         <w:pStyle w:val="Heading3"/>
       </w:pPr>
       <w:r>
-        <w:t xml:space="preserve">3.1. Zero-Data Production Mode &amp; Hardware Auto-Discovery</w:t>
-      </w:r>
-    </w:p>
-    <w:p>
-      <w:pPr>
-        <w:pStyle w:val="FirstParagraph"/>
-      </w:pPr>
-      <w:r>
-        <w:t xml:space="preserve">Unlike mock dashboards with synthetic nodes, V-Monitor operates in</w:t>
-      </w:r>
-      <w:r>
-        <w:t xml:space="preserve"> </w:t>
-      </w:r>
-      <w:r>
-        <w:rPr>
-          <w:b/>
-          <w:bCs/>
-        </w:rPr>
-        <w:t xml:space="preserve">Zero-Data Mode</w:t>
-      </w:r>
-      <w:r>
-        <w:t xml:space="preserve"> </w:t>
-      </w:r>
-      <w:r>
-        <w:t xml:space="preserve">by default. It discovers real network interfaces (</w:t>
-      </w:r>
-      <w:r>
-        <w:rPr>
-          <w:rStyle w:val="VerbatimChar"/>
-        </w:rPr>
-        <w:t xml:space="preserve">eno1</w:t>
-      </w:r>
-      <w:r>
-        <w:t xml:space="preserve">,</w:t>
-      </w:r>
-      <w:r>
-        <w:t xml:space="preserve"> </w:t>
-      </w:r>
-      <w:r>
-        <w:rPr>
-          <w:rStyle w:val="VerbatimChar"/>
-        </w:rPr>
-        <w:t xml:space="preserve">eth0</w:t>
-      </w:r>
-      <w:r>
-        <w:t xml:space="preserve">,</w:t>
-      </w:r>
-      <w:r>
-        <w:t xml:space="preserve"> </w:t>
-      </w:r>
-      <w:r>
-        <w:rPr>
-          <w:rStyle w:val="VerbatimChar"/>
-        </w:rPr>
-        <w:t xml:space="preserve">wg0</w:t>
-      </w:r>
-      <w:r>
-        <w:t xml:space="preserve">), maps live Layer-2 ARP neighbors, runs genuine ICMP echo diagnostics via</w:t>
-      </w:r>
-      <w:r>
-        <w:t xml:space="preserve"> </w:t>
-      </w:r>
-      <w:r>
-        <w:rPr>
-          <w:rStyle w:val="VerbatimChar"/>
-        </w:rPr>
-        <w:t xml:space="preserve">child_process.execFile</w:t>
-      </w:r>
-      <w:r>
-        <w:t xml:space="preserve">, and displays actual hardware telemetry.</w:t>
-      </w:r>
-    </w:p>
-    <w:bookmarkEnd w:id="14"/>
-    <w:bookmarkStart w:id="15" w:name="sovereign-edge-mesh-multi-wan-bundling"/>
-    <w:p>
-      <w:pPr>
-        <w:pStyle w:val="Heading3"/>
-      </w:pPr>
-      <w:r>
-        <w:t xml:space="preserve">3.2. Sovereign Edge Mesh &amp; Multi-WAN Bundling</w:t>
+        <w:t xml:space="preserve">3.1. Sovereign Network Governance &amp; Telecommunications Compliance</w:t>
       </w:r>
     </w:p>
     <w:p>
@@ -551,13 +523,13 @@
           <w:b/>
           <w:bCs/>
         </w:rPr>
-        <w:t xml:space="preserve">Multi-Transport Aggregation:</w:t>
-      </w:r>
-      <w:r>
-        <w:t xml:space="preserve"> </w:t>
-      </w:r>
-      <w:r>
-        <w:t xml:space="preserve">Aggregates divergent physical transports (Dedicated Fiber DIA, Starlink LEO Satellite, Carrier Ethernet, and 5G cellular) into a single virtual tunnel.</w:t>
+        <w:t xml:space="preserve">Underlay vs. Governance Overlay Separation:</w:t>
+      </w:r>
+      <w:r>
+        <w:t xml:space="preserve"> </w:t>
+      </w:r>
+      <w:r>
+        <w:t xml:space="preserve">Satellite and cellular underlays provide raw bandwidth, while the cryptographic WireGuard overlay forces all traffic to terminate inside licensed domestic carrier PoPs.</w:t>
       </w:r>
     </w:p>
     <w:p>
@@ -573,13 +545,13 @@
           <w:b/>
           <w:bCs/>
         </w:rPr>
-        <w:t xml:space="preserve">Sub-Second BFD Probing:</w:t>
-      </w:r>
-      <w:r>
-        <w:t xml:space="preserve"> </w:t>
-      </w:r>
-      <w:r>
-        <w:t xml:space="preserve">Continuous Bidirectional Forwarding Detection (1000ms down to 50ms) tracks roundtrip latency, packet loss, and jitter in real time.</w:t>
+        <w:t xml:space="preserve">National Sovereign IP Localization:</w:t>
+      </w:r>
+      <w:r>
+        <w:t xml:space="preserve"> </w:t>
+      </w:r>
+      <w:r>
+        <w:t xml:space="preserve">Enforces domestic breakout using registered national IP pools, preventing foreign CGNAT IP assignment from masking traffic origins.</w:t>
       </w:r>
     </w:p>
     <w:p>
@@ -595,38 +567,13 @@
           <w:b/>
           <w:bCs/>
         </w:rPr>
-        <w:t xml:space="preserve">WireGuard Overlay:</w:t>
-      </w:r>
-      <w:r>
-        <w:t xml:space="preserve"> </w:t>
-      </w:r>
-      <w:r>
-        <w:t xml:space="preserve">Cryptographically isolated overlays powered by ChaCha20-Poly1305 and Curve25519 ECDH keypairs with autogenerated</w:t>
-      </w:r>
-      <w:r>
-        <w:t xml:space="preserve"> </w:t>
-      </w:r>
-      <w:r>
-        <w:rPr>
-          <w:rStyle w:val="VerbatimChar"/>
-        </w:rPr>
-        <w:t xml:space="preserve">/etc/wireguard/wg0.conf</w:t>
-      </w:r>
-      <w:r>
-        <w:t xml:space="preserve"> </w:t>
-      </w:r>
-      <w:r>
-        <w:t xml:space="preserve">profiles.</w:t>
-      </w:r>
-    </w:p>
-    <w:bookmarkEnd w:id="15"/>
-    <w:bookmarkStart w:id="16" w:name="autonomous-ai-noc-self-healing"/>
-    <w:p>
-      <w:pPr>
-        <w:pStyle w:val="Heading3"/>
-      </w:pPr>
-      <w:r>
-        <w:t xml:space="preserve">3.3. Autonomous AI-NOC &amp; Self-Healing</w:t>
+        <w:t xml:space="preserve">Regulatory Lawful Interception (ETSI / CALEA):</w:t>
+      </w:r>
+      <w:r>
+        <w:t xml:space="preserve"> </w:t>
+      </w:r>
+      <w:r>
+        <w:t xml:space="preserve">Enables lawful packet inspection, telecommunications tariff compliance, and security monitoring strictly at the sovereign PoP boundary.</w:t>
       </w:r>
     </w:p>
     <w:p>
@@ -634,7 +581,7 @@
         <w:pStyle w:val="Compact"/>
         <w:numPr>
           <w:ilvl w:val="0"/>
-          <w:numId w:val="1003"/>
+          <w:numId w:val="1002"/>
         </w:numPr>
       </w:pPr>
       <w:r>
@@ -642,212 +589,13 @@
           <w:b/>
           <w:bCs/>
         </w:rPr>
-        <w:t xml:space="preserve">Root Cause Analysis (RCA):</w:t>
-      </w:r>
-      <w:r>
-        <w:t xml:space="preserve"> </w:t>
-      </w:r>
-      <w:r>
-        <w:t xml:space="preserve">Automated diagnostic engine analyzes topological dependencies and telemetry to distinguish between physical fiber cuts, BGP route flaps, and carrier drops.</w:t>
-      </w:r>
-    </w:p>
-    <w:p>
-      <w:pPr>
-        <w:pStyle w:val="Compact"/>
-        <w:numPr>
-          <w:ilvl w:val="0"/>
-          <w:numId w:val="1003"/>
-        </w:numPr>
-      </w:pPr>
-      <w:r>
-        <w:rPr>
-          <w:b/>
-          <w:bCs/>
-        </w:rPr>
-        <w:t xml:space="preserve">Automated Remediation Playbooks:</w:t>
-      </w:r>
-    </w:p>
-    <w:p>
-      <w:pPr>
-        <w:pStyle w:val="Compact"/>
-        <w:numPr>
-          <w:ilvl w:val="1"/>
-          <w:numId w:val="1004"/>
-        </w:numPr>
-      </w:pPr>
-      <w:r>
-        <w:rPr>
-          <w:rStyle w:val="VerbatimChar"/>
-        </w:rPr>
-        <w:t xml:space="preserve">AUTO_REMEDIATE</w:t>
-      </w:r>
-      <w:r>
-        <w:t xml:space="preserve">: Flushes stale ARP bindings, steers BGP route weights over secondary paths, and restores connectivity.</w:t>
-      </w:r>
-    </w:p>
-    <w:p>
-      <w:pPr>
-        <w:pStyle w:val="Compact"/>
-        <w:numPr>
-          <w:ilvl w:val="1"/>
-          <w:numId w:val="1004"/>
-        </w:numPr>
-      </w:pPr>
-      <w:r>
-        <w:rPr>
-          <w:rStyle w:val="VerbatimChar"/>
-        </w:rPr>
-        <w:t xml:space="preserve">SWITCH_CARRIER</w:t>
-      </w:r>
-      <w:r>
-        <w:t xml:space="preserve">: Dynamically shifts traffic to backup Starlink LEO constellations during terrestrial fiber cuts.</w:t>
-      </w:r>
-    </w:p>
-    <w:p>
-      <w:pPr>
-        <w:pStyle w:val="Compact"/>
-        <w:numPr>
-          <w:ilvl w:val="1"/>
-          <w:numId w:val="1004"/>
-        </w:numPr>
-      </w:pPr>
-      <w:r>
-        <w:rPr>
-          <w:rStyle w:val="VerbatimChar"/>
-        </w:rPr>
-        <w:t xml:space="preserve">FLUSH_ARP_REBIND</w:t>
-      </w:r>
-      <w:r>
-        <w:t xml:space="preserve">: Clears stale kernel MAC tables directly on physical host interfaces.</w:t>
-      </w:r>
-    </w:p>
-    <w:bookmarkEnd w:id="16"/>
-    <w:bookmarkStart w:id="17" w:name="X64c05f3777aee276dec5a25f73084e74ff7619a"/>
-    <w:p>
-      <w:pPr>
-        <w:pStyle w:val="Heading3"/>
-      </w:pPr>
-      <w:r>
-        <w:t xml:space="preserve">3.4. 360° Operational Cockpit &amp; Interactive Web Terminal</w:t>
-      </w:r>
-    </w:p>
-    <w:p>
-      <w:pPr>
-        <w:pStyle w:val="Compact"/>
-        <w:numPr>
-          <w:ilvl w:val="0"/>
-          <w:numId w:val="1005"/>
-        </w:numPr>
-      </w:pPr>
-      <w:r>
-        <w:rPr>
-          <w:b/>
-          <w:bCs/>
-        </w:rPr>
-        <w:t xml:space="preserve">Site Cockpit Drawer:</w:t>
-      </w:r>
-      <w:r>
-        <w:t xml:space="preserve"> </w:t>
-      </w:r>
-      <w:r>
-        <w:t xml:space="preserve">Live inspection of active WAN uplinks, LAN subnets, connected nodes, appliance CPU/thermals, and 60-minute latency sparklines.</w:t>
-      </w:r>
-    </w:p>
-    <w:p>
-      <w:pPr>
-        <w:pStyle w:val="Compact"/>
-        <w:numPr>
-          <w:ilvl w:val="0"/>
-          <w:numId w:val="1005"/>
-        </w:numPr>
-      </w:pPr>
-      <w:r>
-        <w:rPr>
-          <w:b/>
-          <w:bCs/>
-        </w:rPr>
-        <w:t xml:space="preserve">Remote VM Shell:</w:t>
-      </w:r>
-      <w:r>
-        <w:t xml:space="preserve"> </w:t>
-      </w:r>
-      <w:r>
-        <w:t xml:space="preserve">Web-based interactive terminal providing authenticated command execution (</w:t>
-      </w:r>
-      <w:r>
-        <w:rPr>
-          <w:rStyle w:val="VerbatimChar"/>
-        </w:rPr>
-        <w:t xml:space="preserve">uptime</w:t>
-      </w:r>
-      <w:r>
-        <w:t xml:space="preserve">,</w:t>
-      </w:r>
-      <w:r>
-        <w:t xml:space="preserve"> </w:t>
-      </w:r>
-      <w:r>
-        <w:rPr>
-          <w:rStyle w:val="VerbatimChar"/>
-        </w:rPr>
-        <w:t xml:space="preserve">ip a</w:t>
-      </w:r>
-      <w:r>
-        <w:t xml:space="preserve">,</w:t>
-      </w:r>
-      <w:r>
-        <w:t xml:space="preserve"> </w:t>
-      </w:r>
-      <w:r>
-        <w:rPr>
-          <w:rStyle w:val="VerbatimChar"/>
-        </w:rPr>
-        <w:t xml:space="preserve">ip route</w:t>
-      </w:r>
-      <w:r>
-        <w:t xml:space="preserve">,</w:t>
-      </w:r>
-      <w:r>
-        <w:t xml:space="preserve"> </w:t>
-      </w:r>
-      <w:r>
-        <w:rPr>
-          <w:rStyle w:val="VerbatimChar"/>
-        </w:rPr>
-        <w:t xml:space="preserve">ss -tulpn</w:t>
-      </w:r>
-      <w:r>
-        <w:t xml:space="preserve">,</w:t>
-      </w:r>
-      <w:r>
-        <w:t xml:space="preserve"> </w:t>
-      </w:r>
-      <w:r>
-        <w:rPr>
-          <w:rStyle w:val="VerbatimChar"/>
-        </w:rPr>
-        <w:t xml:space="preserve">systemctl status</w:t>
-      </w:r>
-      <w:r>
-        <w:t xml:space="preserve">) directly on managed remote nodes.</w:t>
-      </w:r>
-    </w:p>
-    <w:bookmarkEnd w:id="17"/>
-    <w:bookmarkStart w:id="18" w:name="regulatory-ai-compliance-hub"/>
-    <w:p>
-      <w:pPr>
-        <w:pStyle w:val="Heading3"/>
-      </w:pPr>
-      <w:r>
-        <w:t xml:space="preserve">3.5. Regulatory AI Compliance Hub</w:t>
-      </w:r>
-    </w:p>
-    <w:p>
-      <w:pPr>
-        <w:pStyle w:val="FirstParagraph"/>
-      </w:pPr>
-      <w:r>
-        <w:t xml:space="preserve">Bidirectional integration with Cloud Production (</w:t>
+        <w:t xml:space="preserve">Multi-Framework Governance Auditing:</w:t>
+      </w:r>
+      <w:r>
+        <w:t xml:space="preserve"> </w:t>
+      </w:r>
+      <w:r>
+        <w:t xml:space="preserve">Real-time compliance verification for SOC 2 Type II, ISO 27001, PCI-DSS 4.0, and sovereign cross-border data protection acts via the cloud AI Compliance Hub (</w:t>
       </w:r>
       <w:hyperlink r:id="rId10">
         <w:r>
@@ -858,13 +606,25 @@
         </w:r>
       </w:hyperlink>
       <w:r>
-        <w:t xml:space="preserve">) and local audit engines:</w:t>
-      </w:r>
-      <w:r>
-        <w:t xml:space="preserve"> </w:t>
-      </w:r>
-      <w:r>
-        <w:t xml:space="preserve">-</w:t>
+        <w:t xml:space="preserve">).</w:t>
+      </w:r>
+    </w:p>
+    <w:bookmarkEnd w:id="14"/>
+    <w:bookmarkStart w:id="15" w:name="Xaf471fbbb20238b2fc782942a27b78111463112"/>
+    <w:p>
+      <w:pPr>
+        <w:pStyle w:val="Heading3"/>
+      </w:pPr>
+      <w:r>
+        <w:t xml:space="preserve">3.2. Zero-Data Production Mode &amp; Hardware Auto-Discovery</w:t>
+      </w:r>
+    </w:p>
+    <w:p>
+      <w:pPr>
+        <w:pStyle w:val="FirstParagraph"/>
+      </w:pPr>
+      <w:r>
+        <w:t xml:space="preserve">Unlike mock dashboards, V-Monitor operates in</w:t>
       </w:r>
       <w:r>
         <w:t xml:space="preserve"> </w:t>
@@ -874,75 +634,261 @@
           <w:b/>
           <w:bCs/>
         </w:rPr>
-        <w:t xml:space="preserve">SOC 2 Type II &amp; ISO 27001:</w:t>
-      </w:r>
-      <w:r>
-        <w:t xml:space="preserve"> </w:t>
-      </w:r>
-      <w:r>
-        <w:t xml:space="preserve">Automated verification of access controls and network change audits.</w:t>
-      </w:r>
-      <w:r>
-        <w:t xml:space="preserve"> </w:t>
-      </w:r>
-      <w:r>
-        <w:t xml:space="preserve">-</w:t>
-      </w:r>
-      <w:r>
-        <w:t xml:space="preserve"> </w:t>
-      </w:r>
+        <w:t xml:space="preserve">Zero-Data Mode</w:t>
+      </w:r>
+      <w:r>
+        <w:t xml:space="preserve"> </w:t>
+      </w:r>
+      <w:r>
+        <w:t xml:space="preserve">by default. It discovers real network interfaces (</w:t>
+      </w:r>
+      <w:r>
+        <w:rPr>
+          <w:rStyle w:val="VerbatimChar"/>
+        </w:rPr>
+        <w:t xml:space="preserve">eno1</w:t>
+      </w:r>
+      <w:r>
+        <w:t xml:space="preserve">,</w:t>
+      </w:r>
+      <w:r>
+        <w:t xml:space="preserve"> </w:t>
+      </w:r>
+      <w:r>
+        <w:rPr>
+          <w:rStyle w:val="VerbatimChar"/>
+        </w:rPr>
+        <w:t xml:space="preserve">eth0</w:t>
+      </w:r>
+      <w:r>
+        <w:t xml:space="preserve">,</w:t>
+      </w:r>
+      <w:r>
+        <w:t xml:space="preserve"> </w:t>
+      </w:r>
+      <w:r>
+        <w:rPr>
+          <w:rStyle w:val="VerbatimChar"/>
+        </w:rPr>
+        <w:t xml:space="preserve">wg0</w:t>
+      </w:r>
+      <w:r>
+        <w:t xml:space="preserve">), maps live Layer-2 ARP neighbors, runs genuine ICMP echo diagnostics via</w:t>
+      </w:r>
+      <w:r>
+        <w:t xml:space="preserve"> </w:t>
+      </w:r>
+      <w:r>
+        <w:rPr>
+          <w:rStyle w:val="VerbatimChar"/>
+        </w:rPr>
+        <w:t xml:space="preserve">child_process.execFile</w:t>
+      </w:r>
+      <w:r>
+        <w:t xml:space="preserve">, and displays real hardware telemetry.</w:t>
+      </w:r>
+    </w:p>
+    <w:bookmarkEnd w:id="15"/>
+    <w:bookmarkStart w:id="16" w:name="sovereign-edge-mesh-multi-wan-bundling"/>
+    <w:p>
+      <w:pPr>
+        <w:pStyle w:val="Heading3"/>
+      </w:pPr>
+      <w:r>
+        <w:t xml:space="preserve">3.3. Sovereign Edge Mesh &amp; Multi-WAN Bundling</w:t>
+      </w:r>
+    </w:p>
+    <w:p>
+      <w:pPr>
+        <w:pStyle w:val="Compact"/>
+        <w:numPr>
+          <w:ilvl w:val="0"/>
+          <w:numId w:val="1003"/>
+        </w:numPr>
+      </w:pPr>
       <w:r>
         <w:rPr>
           <w:b/>
           <w:bCs/>
         </w:rPr>
-        <w:t xml:space="preserve">PCI-DSS 4.0:</w:t>
-      </w:r>
-      <w:r>
-        <w:t xml:space="preserve"> </w:t>
-      </w:r>
-      <w:r>
-        <w:t xml:space="preserve">Strict VRF cryptographic isolation between banking/POS DMZ and general network traffic.</w:t>
-      </w:r>
-      <w:r>
-        <w:t xml:space="preserve"> </w:t>
-      </w:r>
-      <w:r>
-        <w:t xml:space="preserve">-</w:t>
-      </w:r>
-      <w:r>
-        <w:t xml:space="preserve"> </w:t>
-      </w:r>
+        <w:t xml:space="preserve">Multi-Transport Aggregation:</w:t>
+      </w:r>
+      <w:r>
+        <w:t xml:space="preserve"> </w:t>
+      </w:r>
+      <w:r>
+        <w:t xml:space="preserve">Aggregates divergent physical transports (Dedicated Fiber DIA, Starlink LEO Satellite, Carrier Ethernet, and 5G cellular) into a single virtual tunnel.</w:t>
+      </w:r>
+    </w:p>
+    <w:p>
+      <w:pPr>
+        <w:pStyle w:val="Compact"/>
+        <w:numPr>
+          <w:ilvl w:val="0"/>
+          <w:numId w:val="1003"/>
+        </w:numPr>
+      </w:pPr>
       <w:r>
         <w:rPr>
           <w:b/>
           <w:bCs/>
         </w:rPr>
-        <w:t xml:space="preserve">Data Sovereignty:</w:t>
-      </w:r>
-      <w:r>
-        <w:t xml:space="preserve"> </w:t>
-      </w:r>
-      <w:r>
-        <w:t xml:space="preserve">Cryptographic confirmation that encrypted payload packets stay within designated sovereign geographic boundaries.</w:t>
-      </w:r>
-    </w:p>
-    <w:p>
-      <w:r>
-        <w:pict>
-          <v:rect style="width:0;height:1.5pt" o:hralign="center" o:hrstd="t" o:hr="t"/>
-        </w:pict>
-      </w:r>
-    </w:p>
-    <w:bookmarkEnd w:id="18"/>
-    <w:bookmarkEnd w:id="19"/>
-    <w:bookmarkStart w:id="20" w:name="key-target-personas-use-cases"/>
-    <w:p>
-      <w:pPr>
-        <w:pStyle w:val="Heading2"/>
-      </w:pPr>
-      <w:r>
-        <w:t xml:space="preserve">4. Key Target Personas &amp; Use Cases</w:t>
+        <w:t xml:space="preserve">Sub-Second BFD Probing:</w:t>
+      </w:r>
+      <w:r>
+        <w:t xml:space="preserve"> </w:t>
+      </w:r>
+      <w:r>
+        <w:t xml:space="preserve">Continuous Bidirectional Forwarding Detection (1000ms down to 50ms) tracks roundtrip latency, packet loss, and jitter in real time.</w:t>
+      </w:r>
+    </w:p>
+    <w:p>
+      <w:pPr>
+        <w:pStyle w:val="Compact"/>
+        <w:numPr>
+          <w:ilvl w:val="0"/>
+          <w:numId w:val="1003"/>
+        </w:numPr>
+      </w:pPr>
+      <w:r>
+        <w:rPr>
+          <w:b/>
+          <w:bCs/>
+        </w:rPr>
+        <w:t xml:space="preserve">WireGuard Overlay:</w:t>
+      </w:r>
+      <w:r>
+        <w:t xml:space="preserve"> </w:t>
+      </w:r>
+      <w:r>
+        <w:t xml:space="preserve">Cryptographically isolated overlays powered by ChaCha20-Poly1305 and Curve25519 ECDH keypairs with autogenerated</w:t>
+      </w:r>
+      <w:r>
+        <w:t xml:space="preserve"> </w:t>
+      </w:r>
+      <w:r>
+        <w:rPr>
+          <w:rStyle w:val="VerbatimChar"/>
+        </w:rPr>
+        <w:t xml:space="preserve">/etc/wireguard/wg0.conf</w:t>
+      </w:r>
+      <w:r>
+        <w:t xml:space="preserve"> </w:t>
+      </w:r>
+      <w:r>
+        <w:t xml:space="preserve">profiles.</w:t>
+      </w:r>
+    </w:p>
+    <w:bookmarkEnd w:id="16"/>
+    <w:bookmarkStart w:id="17" w:name="autonomous-ai-noc-self-healing"/>
+    <w:p>
+      <w:pPr>
+        <w:pStyle w:val="Heading3"/>
+      </w:pPr>
+      <w:r>
+        <w:t xml:space="preserve">3.4. Autonomous AI-NOC &amp; Self-Healing</w:t>
+      </w:r>
+    </w:p>
+    <w:p>
+      <w:pPr>
+        <w:pStyle w:val="Compact"/>
+        <w:numPr>
+          <w:ilvl w:val="0"/>
+          <w:numId w:val="1004"/>
+        </w:numPr>
+      </w:pPr>
+      <w:r>
+        <w:rPr>
+          <w:b/>
+          <w:bCs/>
+        </w:rPr>
+        <w:t xml:space="preserve">Root Cause Analysis (RCA):</w:t>
+      </w:r>
+      <w:r>
+        <w:t xml:space="preserve"> </w:t>
+      </w:r>
+      <w:r>
+        <w:t xml:space="preserve">Automated diagnostic engine analyzes topological dependencies and telemetry to distinguish between physical fiber cuts, BGP route flaps, and carrier drops.</w:t>
+      </w:r>
+    </w:p>
+    <w:p>
+      <w:pPr>
+        <w:pStyle w:val="Compact"/>
+        <w:numPr>
+          <w:ilvl w:val="0"/>
+          <w:numId w:val="1004"/>
+        </w:numPr>
+      </w:pPr>
+      <w:r>
+        <w:rPr>
+          <w:b/>
+          <w:bCs/>
+        </w:rPr>
+        <w:t xml:space="preserve">Automated Remediation Playbooks:</w:t>
+      </w:r>
+    </w:p>
+    <w:p>
+      <w:pPr>
+        <w:pStyle w:val="Compact"/>
+        <w:numPr>
+          <w:ilvl w:val="1"/>
+          <w:numId w:val="1005"/>
+        </w:numPr>
+      </w:pPr>
+      <w:r>
+        <w:rPr>
+          <w:rStyle w:val="VerbatimChar"/>
+        </w:rPr>
+        <w:t xml:space="preserve">AUTO_REMEDIATE</w:t>
+      </w:r>
+      <w:r>
+        <w:t xml:space="preserve">: Flushes stale ARP bindings, steers BGP route weights over secondary paths, and restores connectivity.</w:t>
+      </w:r>
+    </w:p>
+    <w:p>
+      <w:pPr>
+        <w:pStyle w:val="Compact"/>
+        <w:numPr>
+          <w:ilvl w:val="1"/>
+          <w:numId w:val="1005"/>
+        </w:numPr>
+      </w:pPr>
+      <w:r>
+        <w:rPr>
+          <w:rStyle w:val="VerbatimChar"/>
+        </w:rPr>
+        <w:t xml:space="preserve">SWITCH_CARRIER</w:t>
+      </w:r>
+      <w:r>
+        <w:t xml:space="preserve">: Dynamically shifts traffic to backup Starlink LEO constellations during terrestrial fiber cuts.</w:t>
+      </w:r>
+    </w:p>
+    <w:p>
+      <w:pPr>
+        <w:pStyle w:val="Compact"/>
+        <w:numPr>
+          <w:ilvl w:val="1"/>
+          <w:numId w:val="1005"/>
+        </w:numPr>
+      </w:pPr>
+      <w:r>
+        <w:rPr>
+          <w:rStyle w:val="VerbatimChar"/>
+        </w:rPr>
+        <w:t xml:space="preserve">FLUSH_ARP_REBIND</w:t>
+      </w:r>
+      <w:r>
+        <w:t xml:space="preserve">: Clears stale kernel MAC tables directly on physical host interfaces.</w:t>
+      </w:r>
+    </w:p>
+    <w:bookmarkEnd w:id="17"/>
+    <w:bookmarkStart w:id="18" w:name="X64c05f3777aee276dec5a25f73084e74ff7619a"/>
+    <w:p>
+      <w:pPr>
+        <w:pStyle w:val="Heading3"/>
+      </w:pPr>
+      <w:r>
+        <w:t xml:space="preserve">3.5. 360° Operational Cockpit &amp; Interactive Web Terminal</w:t>
       </w:r>
     </w:p>
     <w:p>
@@ -958,13 +904,13 @@
           <w:b/>
           <w:bCs/>
         </w:rPr>
-        <w:t xml:space="preserve">Telecom Carriers &amp; Managed Service Providers (MSPs):</w:t>
-      </w:r>
-      <w:r>
-        <w:t xml:space="preserve"> </w:t>
-      </w:r>
-      <w:r>
-        <w:t xml:space="preserve">Multi-tenant control plane enabling a single NOC team to manage hundreds of isolated enterprise customer networks with zero hardware vendor lock-in.</w:t>
+        <w:t xml:space="preserve">Site Cockpit Drawer:</w:t>
+      </w:r>
+      <w:r>
+        <w:t xml:space="preserve"> </w:t>
+      </w:r>
+      <w:r>
+        <w:t xml:space="preserve">Live inspection of active WAN uplinks, LAN subnets, connected nodes, appliance CPU/thermals, and 60-minute latency sparklines.</w:t>
       </w:r>
     </w:p>
     <w:p>
@@ -980,13 +926,88 @@
           <w:b/>
           <w:bCs/>
         </w:rPr>
-        <w:t xml:space="preserve">Banking &amp; Financial Institutions:</w:t>
-      </w:r>
-      <w:r>
-        <w:t xml:space="preserve"> </w:t>
-      </w:r>
-      <w:r>
-        <w:t xml:space="preserve">Guarantees sub-second failover for mission-critical SWIFT and POS transactions from primary optical fiber to backup Starlink satellite links during terrestrial outages.</w:t>
+        <w:t xml:space="preserve">Remote VM Shell:</w:t>
+      </w:r>
+      <w:r>
+        <w:t xml:space="preserve"> </w:t>
+      </w:r>
+      <w:r>
+        <w:t xml:space="preserve">Web-based interactive terminal providing authenticated command execution (</w:t>
+      </w:r>
+      <w:r>
+        <w:rPr>
+          <w:rStyle w:val="VerbatimChar"/>
+        </w:rPr>
+        <w:t xml:space="preserve">uptime</w:t>
+      </w:r>
+      <w:r>
+        <w:t xml:space="preserve">,</w:t>
+      </w:r>
+      <w:r>
+        <w:t xml:space="preserve"> </w:t>
+      </w:r>
+      <w:r>
+        <w:rPr>
+          <w:rStyle w:val="VerbatimChar"/>
+        </w:rPr>
+        <w:t xml:space="preserve">ip a</w:t>
+      </w:r>
+      <w:r>
+        <w:t xml:space="preserve">,</w:t>
+      </w:r>
+      <w:r>
+        <w:t xml:space="preserve"> </w:t>
+      </w:r>
+      <w:r>
+        <w:rPr>
+          <w:rStyle w:val="VerbatimChar"/>
+        </w:rPr>
+        <w:t xml:space="preserve">ip route</w:t>
+      </w:r>
+      <w:r>
+        <w:t xml:space="preserve">,</w:t>
+      </w:r>
+      <w:r>
+        <w:t xml:space="preserve"> </w:t>
+      </w:r>
+      <w:r>
+        <w:rPr>
+          <w:rStyle w:val="VerbatimChar"/>
+        </w:rPr>
+        <w:t xml:space="preserve">ss -tulpn</w:t>
+      </w:r>
+      <w:r>
+        <w:t xml:space="preserve">,</w:t>
+      </w:r>
+      <w:r>
+        <w:t xml:space="preserve"> </w:t>
+      </w:r>
+      <w:r>
+        <w:rPr>
+          <w:rStyle w:val="VerbatimChar"/>
+        </w:rPr>
+        <w:t xml:space="preserve">systemctl status</w:t>
+      </w:r>
+      <w:r>
+        <w:t xml:space="preserve">) directly on managed remote nodes.</w:t>
+      </w:r>
+    </w:p>
+    <w:p>
+      <w:r>
+        <w:pict>
+          <v:rect style="width:0;height:1.5pt" o:hralign="center" o:hrstd="t" o:hr="t"/>
+        </w:pict>
+      </w:r>
+    </w:p>
+    <w:bookmarkEnd w:id="18"/>
+    <w:bookmarkEnd w:id="19"/>
+    <w:bookmarkStart w:id="20" w:name="key-target-personas-use-cases"/>
+    <w:p>
+      <w:pPr>
+        <w:pStyle w:val="Heading2"/>
+      </w:pPr>
+      <w:r>
+        <w:t xml:space="preserve">4. Key Target Personas &amp; Use Cases</w:t>
       </w:r>
     </w:p>
     <w:p>
@@ -994,7 +1015,7 @@
         <w:pStyle w:val="Compact"/>
         <w:numPr>
           <w:ilvl w:val="0"/>
-          <w:numId w:val="1006"/>
+          <w:numId w:val="1007"/>
         </w:numPr>
       </w:pPr>
       <w:r>
@@ -1002,13 +1023,13 @@
           <w:b/>
           <w:bCs/>
         </w:rPr>
-        <w:t xml:space="preserve">Defense, Offshore &amp; Maritime Operations:</w:t>
-      </w:r>
-      <w:r>
-        <w:t xml:space="preserve"> </w:t>
-      </w:r>
-      <w:r>
-        <w:t xml:space="preserve">Hybrid WAN bonding pairs low-earth orbit (Starlink LEO) with 5G cellular to maintain uninterrupted connectivity for remote oil rigs, mining facilities, and tactical field deployments.</w:t>
+        <w:t xml:space="preserve">National Telecom Regulators &amp; Cyber Authorities:</w:t>
+      </w:r>
+      <w:r>
+        <w:t xml:space="preserve"> </w:t>
+      </w:r>
+      <w:r>
+        <w:t xml:space="preserve">Regulate enterprise LEO satellite deployments (Starlink) by mandating ICG compliance gateways to enforce lawful interception, security oversight, and domestic tax/tariff governance.</w:t>
       </w:r>
     </w:p>
     <w:p>
@@ -1016,7 +1037,7 @@
         <w:pStyle w:val="Compact"/>
         <w:numPr>
           <w:ilvl w:val="0"/>
-          <w:numId w:val="1006"/>
+          <w:numId w:val="1007"/>
         </w:numPr>
       </w:pPr>
       <w:r>
@@ -1024,13 +1045,57 @@
           <w:b/>
           <w:bCs/>
         </w:rPr>
-        <w:t xml:space="preserve">Healthcare Networks:</w:t>
-      </w:r>
-      <w:r>
-        <w:t xml:space="preserve"> </w:t>
-      </w:r>
-      <w:r>
-        <w:t xml:space="preserve">Real-time QoS traffic steering guarantees ultra-low latency for telemedicine and robotic surgical streams while maintaining strict HIPAA data compliance.</w:t>
+        <w:t xml:space="preserve">Tier-1 Telecom Carriers &amp; Domestic ISPs:</w:t>
+      </w:r>
+      <w:r>
+        <w:t xml:space="preserve"> </w:t>
+      </w:r>
+      <w:r>
+        <w:t xml:space="preserve">Monetize LEO satellite integration by providing domestic PoP termination, sovereign IP anchoring, and managed SLA failover to enterprise customers.</w:t>
+      </w:r>
+    </w:p>
+    <w:p>
+      <w:pPr>
+        <w:pStyle w:val="Compact"/>
+        <w:numPr>
+          <w:ilvl w:val="0"/>
+          <w:numId w:val="1007"/>
+        </w:numPr>
+      </w:pPr>
+      <w:r>
+        <w:rPr>
+          <w:b/>
+          <w:bCs/>
+        </w:rPr>
+        <w:t xml:space="preserve">Banking &amp; Financial Institutions:</w:t>
+      </w:r>
+      <w:r>
+        <w:t xml:space="preserve"> </w:t>
+      </w:r>
+      <w:r>
+        <w:t xml:space="preserve">Guarantees sub-second failover for mission-critical SWIFT and POS transactions while strictly honoring financial data residency laws that forbid financial records from leaving national soil.</w:t>
+      </w:r>
+    </w:p>
+    <w:p>
+      <w:pPr>
+        <w:pStyle w:val="Compact"/>
+        <w:numPr>
+          <w:ilvl w:val="0"/>
+          <w:numId w:val="1007"/>
+        </w:numPr>
+      </w:pPr>
+      <w:r>
+        <w:rPr>
+          <w:b/>
+          <w:bCs/>
+        </w:rPr>
+        <w:t xml:space="preserve">Defense, Offshore &amp; Government Enclaves:</w:t>
+      </w:r>
+      <w:r>
+        <w:t xml:space="preserve"> </w:t>
+      </w:r>
+      <w:r>
+        <w:t xml:space="preserve">Hybrid WAN bonding pairs low-earth orbit (Starlink LEO) with 5G cellular to maintain uninterrupted, tamper-proof connectivity for remote tactical, mining, and maritime assets.</w:t>
       </w:r>
     </w:p>
     <w:p>
@@ -1274,7 +1339,7 @@
                 <w:b/>
                 <w:bCs/>
               </w:rPr>
-              <w:t xml:space="preserve">Compliance Cloud</w:t>
+              <w:t xml:space="preserve">Governance Cloud</w:t>
             </w:r>
           </w:p>
         </w:tc>
@@ -1295,7 +1360,7 @@
               <w:t xml:space="preserve">ai-compliance-web-five.vercel.app</w:t>
             </w:r>
             <w:r>
-              <w:t xml:space="preserve">), SOC 2, ISO 27001</w:t>
+              <w:t xml:space="preserve">), SOC 2, ISO 27001, ETSI</w:t>
             </w:r>
           </w:p>
         </w:tc>
@@ -1765,6 +1830,9 @@
     <w:abstractNumId w:val="991"/>
   </w:num>
   <w:num w:numId="1006">
+    <w:abstractNumId w:val="991"/>
+  </w:num>
+  <w:num w:numId="1007">
     <w:abstractNumId w:val="99411"/>
     <w:lvlOverride w:ilvl="0">
       <w:startOverride w:val="1"/>

</xml_diff>

<commit_message>
docs: condense project description to exactly 500 words with governance theme and live links
</commit_message>
<xml_diff>
--- a/V_Monitor_Project_Overview.docx
+++ b/V_Monitor_Project_Overview.docx
@@ -2,7 +2,7 @@
 <file path=word/document.xml><?xml version="1.0" encoding="utf-8"?>
 <w:document xmlns:w="http://schemas.openxmlformats.org/wordprocessingml/2006/main" xmlns:m="http://schemas.openxmlformats.org/officeDocument/2006/math" xmlns:r="http://schemas.openxmlformats.org/officeDocument/2006/relationships" xmlns:o="urn:schemas-microsoft-com:office:office" xmlns:v="urn:schemas-microsoft-com:vml" xmlns:w10="urn:schemas-microsoft-com:office:word" xmlns:a="http://schemas.openxmlformats.org/drawingml/2006/main" xmlns:pic="http://schemas.openxmlformats.org/drawingml/2006/picture" xmlns:wp="http://schemas.openxmlformats.org/drawingml/2006/wordprocessingDrawing">
   <w:body>
-    <w:bookmarkStart w:id="23" w:name="X393f4564ee8ca05c7f98c2d9e34f6d1ea187e49"/>
+    <w:bookmarkStart w:id="17" w:name="X393f4564ee8ca05c7f98c2d9e34f6d1ea187e49"/>
     <w:p>
       <w:pPr>
         <w:pStyle w:val="Heading1"/>
@@ -107,13 +107,13 @@
         <w:t xml:space="preserve">IntelliLink@2026</w:t>
       </w:r>
     </w:p>
-    <w:bookmarkStart w:id="12" w:name="executive-overview"/>
+    <w:bookmarkStart w:id="12" w:name="executive-overview-governance-mission"/>
     <w:p>
       <w:pPr>
         <w:pStyle w:val="Heading2"/>
       </w:pPr>
       <w:r>
-        <w:t xml:space="preserve">1. Executive Overview</w:t>
+        <w:t xml:space="preserve">1. Executive Overview &amp; Governance Mission</w:t>
       </w:r>
     </w:p>
     <w:p>
@@ -125,7 +125,7 @@
           <w:b/>
           <w:bCs/>
         </w:rPr>
-        <w:t xml:space="preserve">V-Monitor (IntelliLink OS)</w:t>
+        <w:t xml:space="preserve">V-Monitor (IntelliLink OS / Intellilink NOG)</w:t>
       </w:r>
       <w:r>
         <w:t xml:space="preserve"> </w:t>
@@ -167,19 +167,141 @@
           <w:b/>
           <w:bCs/>
         </w:rPr>
-        <w:t xml:space="preserve">Telecommunications Governance Platform (Intellilink NOG / ICG)</w:t>
-      </w:r>
-      <w:r>
-        <w:t xml:space="preserve">. Engineered for national regulatory authorities, Tier-1 telecom carriers, banking conglomerates, and sovereign defense enclaves, V-Monitor unites high-speed edge networking with strict regulatory compliance, lawful interception, and data sovereignty governance.</w:t>
-      </w:r>
-    </w:p>
-    <w:bookmarkStart w:id="11" w:name="core-problems-solved"/>
+        <w:t xml:space="preserve">Telecommunications Governance Platform</w:t>
+      </w:r>
+      <w:r>
+        <w:t xml:space="preserve">. Engineered for regulators, telcos, banks, and defense enclaves, V-Monitor reconciles LEO satellite connectivity with national data sovereignty.</w:t>
+      </w:r>
+    </w:p>
+    <w:bookmarkStart w:id="11" w:name="the-governance-dilemma"/>
     <w:p>
       <w:pPr>
         <w:pStyle w:val="Heading3"/>
       </w:pPr>
       <w:r>
-        <w:t xml:space="preserve">Core Problems Solved:</w:t>
+        <w:t xml:space="preserve">The Governance Dilemma:</w:t>
+      </w:r>
+    </w:p>
+    <w:p>
+      <w:pPr>
+        <w:pStyle w:val="FirstParagraph"/>
+      </w:pPr>
+      <w:r>
+        <w:t xml:space="preserve">Foreign satellite links (e.g., Starlink) bypass domestic borders, violating data residency, lawful interception (ETSI/CALEA), and tax frameworks. V-Monitor decouples the</w:t>
+      </w:r>
+      <w:r>
+        <w:t xml:space="preserve"> </w:t>
+      </w:r>
+      <w:r>
+        <w:rPr>
+          <w:b/>
+          <w:bCs/>
+        </w:rPr>
+        <w:t xml:space="preserve">Transport Underlay</w:t>
+      </w:r>
+      <w:r>
+        <w:t xml:space="preserve"> </w:t>
+      </w:r>
+      <w:r>
+        <w:t xml:space="preserve">(satellite/5G) from the</w:t>
+      </w:r>
+      <w:r>
+        <w:t xml:space="preserve"> </w:t>
+      </w:r>
+      <w:r>
+        <w:rPr>
+          <w:b/>
+          <w:bCs/>
+        </w:rPr>
+        <w:t xml:space="preserve">Governance Overlay</w:t>
+      </w:r>
+      <w:r>
+        <w:t xml:space="preserve"> </w:t>
+      </w:r>
+      <w:r>
+        <w:t xml:space="preserve">(domestic ISP PoP breakout). Encrypted enterprise traffic terminates strictly through licensed domestic carrier gateways with sovereign IP address space localization (e.g., AFRINIC subnets).</w:t>
+      </w:r>
+    </w:p>
+    <w:p>
+      <w:r>
+        <w:pict>
+          <v:rect style="width:0;height:1.5pt" o:hralign="center" o:hrstd="t" o:hr="t"/>
+        </w:pict>
+      </w:r>
+    </w:p>
+    <w:bookmarkEnd w:id="11"/>
+    <w:bookmarkEnd w:id="12"/>
+    <w:bookmarkStart w:id="13" w:name="high-level-architecture"/>
+    <w:p>
+      <w:pPr>
+        <w:pStyle w:val="Heading2"/>
+      </w:pPr>
+      <w:r>
+        <w:t xml:space="preserve">2. High-Level Architecture</w:t>
+      </w:r>
+    </w:p>
+    <w:p>
+      <w:pPr>
+        <w:pStyle w:val="SourceCode"/>
+      </w:pPr>
+      <w:r>
+        <w:rPr>
+          <w:rStyle w:val="VerbatimChar"/>
+        </w:rPr>
+        <w:t xml:space="preserve">[ Next.js 14 NOC (:3000) ] ── [ NestJS API (:3001) ] ── [ FastAPI AI (:8100) ]</w:t>
+      </w:r>
+      <w:r>
+        <w:br/>
+      </w:r>
+      <w:r>
+        <w:rPr>
+          <w:rStyle w:val="VerbatimChar"/>
+        </w:rPr>
+        <w:t xml:space="preserve">                                      │</w:t>
+      </w:r>
+      <w:r>
+        <w:br/>
+      </w:r>
+      <w:r>
+        <w:rPr>
+          <w:rStyle w:val="VerbatimChar"/>
+        </w:rPr>
+        <w:t xml:space="preserve">   [ SOVEREIGN DATA PLANE: Domestic PoP Anchoring • ETSI Intercept • MySQL 8 ]</w:t>
+      </w:r>
+      <w:r>
+        <w:br/>
+      </w:r>
+      <w:r>
+        <w:rPr>
+          <w:rStyle w:val="VerbatimChar"/>
+        </w:rPr>
+        <w:t xml:space="preserve">                                      │</w:t>
+      </w:r>
+      <w:r>
+        <w:br/>
+      </w:r>
+      <w:r>
+        <w:rPr>
+          <w:rStyle w:val="VerbatimChar"/>
+        </w:rPr>
+        <w:t xml:space="preserve">   [ MULTI-ORBIT FABRIC: WireGuard Mesh • BFD Probing • Fiber • Starlink • 5G ]</w:t>
+      </w:r>
+    </w:p>
+    <w:p>
+      <w:r>
+        <w:pict>
+          <v:rect style="width:0;height:1.5pt" o:hralign="center" o:hrstd="t" o:hr="t"/>
+        </w:pict>
+      </w:r>
+    </w:p>
+    <w:bookmarkEnd w:id="13"/>
+    <w:bookmarkStart w:id="14" w:name="core-capabilities"/>
+    <w:p>
+      <w:pPr>
+        <w:pStyle w:val="Heading2"/>
+      </w:pPr>
+      <w:r>
+        <w:t xml:space="preserve">3. Core Capabilities</w:t>
       </w:r>
     </w:p>
     <w:p>
@@ -195,45 +317,51 @@
           <w:b/>
           <w:bCs/>
         </w:rPr>
-        <w:t xml:space="preserve">The Satellite Regulatory Dilemma:</w:t>
-      </w:r>
-      <w:r>
-        <w:t xml:space="preserve"> </w:t>
-      </w:r>
-      <w:r>
-        <w:t xml:space="preserve">Unregulated Low-Earth-Orbit (LEO) satellite links (e.g., Starlink) bypass national telecommunications jurisdictions. V-Monitor solves this by separating the</w:t>
-      </w:r>
-      <w:r>
-        <w:t xml:space="preserve"> </w:t>
-      </w:r>
+        <w:t xml:space="preserve">Sovereign Telecommunications Governance:</w:t>
+      </w:r>
+    </w:p>
+    <w:p>
+      <w:pPr>
+        <w:pStyle w:val="Compact"/>
+        <w:numPr>
+          <w:ilvl w:val="1"/>
+          <w:numId w:val="1002"/>
+        </w:numPr>
+      </w:pPr>
       <w:r>
         <w:rPr>
           <w:b/>
           <w:bCs/>
         </w:rPr>
-        <w:t xml:space="preserve">Transport Underlay</w:t>
-      </w:r>
-      <w:r>
-        <w:t xml:space="preserve"> </w:t>
-      </w:r>
-      <w:r>
-        <w:t xml:space="preserve">(satellite/cellular) from the</w:t>
-      </w:r>
-      <w:r>
-        <w:t xml:space="preserve"> </w:t>
-      </w:r>
+        <w:t xml:space="preserve">Underlay/Overlay Decoupling:</w:t>
+      </w:r>
+      <w:r>
+        <w:t xml:space="preserve"> </w:t>
+      </w:r>
+      <w:r>
+        <w:t xml:space="preserve">Enforces domestic breakout for satellite/cellular links at licensed domestic carrier PoPs.</w:t>
+      </w:r>
+    </w:p>
+    <w:p>
+      <w:pPr>
+        <w:pStyle w:val="Compact"/>
+        <w:numPr>
+          <w:ilvl w:val="1"/>
+          <w:numId w:val="1002"/>
+        </w:numPr>
+      </w:pPr>
       <w:r>
         <w:rPr>
           <w:b/>
           <w:bCs/>
         </w:rPr>
-        <w:t xml:space="preserve">Governance Overlay</w:t>
-      </w:r>
-      <w:r>
-        <w:t xml:space="preserve"> </w:t>
-      </w:r>
-      <w:r>
-        <w:t xml:space="preserve">(licensed domestic ISP PoP breakout), guaranteeing national regulatory alignment.</w:t>
+        <w:t xml:space="preserve">Lawful Interception &amp; Auditing:</w:t>
+      </w:r>
+      <w:r>
+        <w:t xml:space="preserve"> </w:t>
+      </w:r>
+      <w:r>
+        <w:t xml:space="preserve">Provides ETSI/CALEA compliance and SOC 2, ISO 27001, and PCI-DSS 4.0 audits via the AI Compliance Hub.</w:t>
       </w:r>
     </w:p>
     <w:p>
@@ -249,13 +377,40 @@
           <w:b/>
           <w:bCs/>
         </w:rPr>
-        <w:t xml:space="preserve">Data Sovereignty Violations &amp; Border Leakage:</w:t>
-      </w:r>
-      <w:r>
-        <w:t xml:space="preserve"> </w:t>
-      </w:r>
-      <w:r>
-        <w:t xml:space="preserve">Prevents enterprise, government, and banking payloads from traversing foreign egress points, anchoring all traffic within sovereign national IP boundaries (e.g., AFRINIC/national address allocations).</w:t>
+        <w:t xml:space="preserve">Zero-Data Production Engine &amp; Real Hardware Telemetry:</w:t>
+      </w:r>
+    </w:p>
+    <w:p>
+      <w:pPr>
+        <w:pStyle w:val="Compact"/>
+        <w:numPr>
+          <w:ilvl w:val="1"/>
+          <w:numId w:val="1003"/>
+        </w:numPr>
+      </w:pPr>
+      <w:r>
+        <w:t xml:space="preserve">Discovers physical interfaces (</w:t>
+      </w:r>
+      <w:r>
+        <w:rPr>
+          <w:rStyle w:val="VerbatimChar"/>
+        </w:rPr>
+        <w:t xml:space="preserve">eno1</w:t>
+      </w:r>
+      <w:r>
+        <w:t xml:space="preserve">,</w:t>
+      </w:r>
+      <w:r>
+        <w:t xml:space="preserve"> </w:t>
+      </w:r>
+      <w:r>
+        <w:rPr>
+          <w:rStyle w:val="VerbatimChar"/>
+        </w:rPr>
+        <w:t xml:space="preserve">wg0</w:t>
+      </w:r>
+      <w:r>
+        <w:t xml:space="preserve">) and Layer-2 ARP neighbors, running genuine ICMP diagnostics with zero synthetic data.</w:t>
       </w:r>
     </w:p>
     <w:p>
@@ -271,13 +426,19 @@
           <w:b/>
           <w:bCs/>
         </w:rPr>
-        <w:t xml:space="preserve">Proprietary Vendor Lock-In:</w:t>
-      </w:r>
-      <w:r>
-        <w:t xml:space="preserve"> </w:t>
-      </w:r>
-      <w:r>
-        <w:t xml:space="preserve">Replaces expensive, closed-box networking hardware (Cisco, Fortinet, Juniper) with an open, high-performance Linux kernel-level architecture (Netlink, eBPF, WireGuard).</w:t>
+        <w:t xml:space="preserve">Multi-Orbit SD-WAN &amp; Sub-Second Failover:</w:t>
+      </w:r>
+    </w:p>
+    <w:p>
+      <w:pPr>
+        <w:pStyle w:val="Compact"/>
+        <w:numPr>
+          <w:ilvl w:val="1"/>
+          <w:numId w:val="1004"/>
+        </w:numPr>
+      </w:pPr>
+      <w:r>
+        <w:t xml:space="preserve">Bundles Fiber, Starlink LEO, and 5G into a WireGuard mesh with continuous BFD probing (down to 50ms) for sub-second failover.</w:t>
       </w:r>
     </w:p>
     <w:p>
@@ -293,538 +454,7 @@
           <w:b/>
           <w:bCs/>
         </w:rPr>
-        <w:t xml:space="preserve">Outage Latency &amp; Manual Triage:</w:t>
-      </w:r>
-      <w:r>
-        <w:t xml:space="preserve"> </w:t>
-      </w:r>
-      <w:r>
-        <w:t xml:space="preserve">Eliminates downtime with sub-second Bidirectional Forwarding Detection (BFD) and automated AI Root Cause Analysis (RCA) that mitigates circuit flaps in milliseconds.</w:t>
-      </w:r>
-    </w:p>
-    <w:p>
-      <w:r>
-        <w:pict>
-          <v:rect style="width:0;height:1.5pt" o:hralign="center" o:hrstd="t" o:hr="t"/>
-        </w:pict>
-      </w:r>
-    </w:p>
-    <w:bookmarkEnd w:id="11"/>
-    <w:bookmarkEnd w:id="12"/>
-    <w:bookmarkStart w:id="13" w:name="Xe9742133071b6617b46c2a3eb5ecf3321ea10e8"/>
-    <w:p>
-      <w:pPr>
-        <w:pStyle w:val="Heading2"/>
-      </w:pPr>
-      <w:r>
-        <w:t xml:space="preserve">2. High-Level Architecture &amp; Governance Decoupling</w:t>
-      </w:r>
-    </w:p>
-    <w:p>
-      <w:pPr>
-        <w:pStyle w:val="SourceCode"/>
-      </w:pPr>
-      <w:r>
-        <w:rPr>
-          <w:rStyle w:val="VerbatimChar"/>
-        </w:rPr>
-        <w:t xml:space="preserve"> ┌────────────────────────────────────────────────────────────────────────┐</w:t>
-      </w:r>
-      <w:r>
-        <w:br/>
-      </w:r>
-      <w:r>
-        <w:rPr>
-          <w:rStyle w:val="VerbatimChar"/>
-        </w:rPr>
-        <w:t xml:space="preserve"> │            V-MONITOR REGULATORY &amp; CONTROL PLANE GOVERNANCE             │</w:t>
-      </w:r>
-      <w:r>
-        <w:br/>
-      </w:r>
-      <w:r>
-        <w:rPr>
-          <w:rStyle w:val="VerbatimChar"/>
-        </w:rPr>
-        <w:t xml:space="preserve"> └─────────────┬──────────────────────────┬─────────────────────────┬─────┘</w:t>
-      </w:r>
-      <w:r>
-        <w:br/>
-      </w:r>
-      <w:r>
-        <w:rPr>
-          <w:rStyle w:val="VerbatimChar"/>
-        </w:rPr>
-        <w:t xml:space="preserve">               │                          │                         │</w:t>
-      </w:r>
-      <w:r>
-        <w:br/>
-      </w:r>
-      <w:r>
-        <w:rPr>
-          <w:rStyle w:val="VerbatimChar"/>
-        </w:rPr>
-        <w:t xml:space="preserve"> ┌─────────────▼────────────┐ ┌───────────▼────────────┐ ┌──────────▼───────────┐</w:t>
-      </w:r>
-      <w:r>
-        <w:br/>
-      </w:r>
-      <w:r>
-        <w:rPr>
-          <w:rStyle w:val="VerbatimChar"/>
-        </w:rPr>
-        <w:t xml:space="preserve"> │ Next.js 14 Web NOC UI    │ │ NestJS Core API Engine │ │ FastAPI AI Inference │</w:t>
-      </w:r>
-      <w:r>
-        <w:br/>
-      </w:r>
-      <w:r>
-        <w:rPr>
-          <w:rStyle w:val="VerbatimChar"/>
-        </w:rPr>
-        <w:t xml:space="preserve"> │ Port 3000 (React Query)  │ │ Port 3001 (TypeORM/DB) │ │ Port 8100 (RCA &amp; ML) │</w:t>
-      </w:r>
-      <w:r>
-        <w:br/>
-      </w:r>
-      <w:r>
-        <w:rPr>
-          <w:rStyle w:val="VerbatimChar"/>
-        </w:rPr>
-        <w:t xml:space="preserve"> └─────────────┬────────────┘ └───────────┬────────────┘ └──────────┬───────────┘</w:t>
-      </w:r>
-      <w:r>
-        <w:br/>
-      </w:r>
-      <w:r>
-        <w:rPr>
-          <w:rStyle w:val="VerbatimChar"/>
-        </w:rPr>
-        <w:t xml:space="preserve">               │                          │                         │</w:t>
-      </w:r>
-      <w:r>
-        <w:br/>
-      </w:r>
-      <w:r>
-        <w:rPr>
-          <w:rStyle w:val="VerbatimChar"/>
-        </w:rPr>
-        <w:t xml:space="preserve"> ┌─────────────▼──────────────────────────▼─────────────────────────▼───────────┐</w:t>
-      </w:r>
-      <w:r>
-        <w:br/>
-      </w:r>
-      <w:r>
-        <w:rPr>
-          <w:rStyle w:val="VerbatimChar"/>
-        </w:rPr>
-        <w:t xml:space="preserve"> │               SOVEREIGN GOVERNANCE &amp; COMPLIANCE DATA PLANE                   │</w:t>
-      </w:r>
-      <w:r>
-        <w:br/>
-      </w:r>
-      <w:r>
-        <w:rPr>
-          <w:rStyle w:val="VerbatimChar"/>
-        </w:rPr>
-        <w:t xml:space="preserve"> │     Lawful Intercept (ETSI) • Domestic PoP Anchoring • MySQL 8 • Redis       │</w:t>
-      </w:r>
-      <w:r>
-        <w:br/>
-      </w:r>
-      <w:r>
-        <w:rPr>
-          <w:rStyle w:val="VerbatimChar"/>
-        </w:rPr>
-        <w:t xml:space="preserve"> └────────────────────────────────────────┬─────────────────────────────────────┘</w:t>
-      </w:r>
-      <w:r>
-        <w:br/>
-      </w:r>
-      <w:r>
-        <w:rPr>
-          <w:rStyle w:val="VerbatimChar"/>
-        </w:rPr>
-        <w:t xml:space="preserve">                                          │</w:t>
-      </w:r>
-      <w:r>
-        <w:br/>
-      </w:r>
-      <w:r>
-        <w:rPr>
-          <w:rStyle w:val="VerbatimChar"/>
-        </w:rPr>
-        <w:t xml:space="preserve"> ┌────────────────────────────────────────▼─────────────────────────────────────┐</w:t>
-      </w:r>
-      <w:r>
-        <w:br/>
-      </w:r>
-      <w:r>
-        <w:rPr>
-          <w:rStyle w:val="VerbatimChar"/>
-        </w:rPr>
-        <w:t xml:space="preserve"> │                MULTI-ORBIT EDGE UNDERLAY &amp; OVERLAY FABRIC                    │</w:t>
-      </w:r>
-      <w:r>
-        <w:br/>
-      </w:r>
-      <w:r>
-        <w:rPr>
-          <w:rStyle w:val="VerbatimChar"/>
-        </w:rPr>
-        <w:t xml:space="preserve"> │  WireGuard Kernel Mesh  •  BFD Engine  •  Fiber DIA  •  Starlink  •  5G WAN  │</w:t>
-      </w:r>
-      <w:r>
-        <w:br/>
-      </w:r>
-      <w:r>
-        <w:rPr>
-          <w:rStyle w:val="VerbatimChar"/>
-        </w:rPr>
-        <w:t xml:space="preserve"> └──────────────────────────────────────────────────────────────────────────────┘</w:t>
-      </w:r>
-    </w:p>
-    <w:p>
-      <w:r>
-        <w:pict>
-          <v:rect style="width:0;height:1.5pt" o:hralign="center" o:hrstd="t" o:hr="t"/>
-        </w:pict>
-      </w:r>
-    </w:p>
-    <w:bookmarkEnd w:id="13"/>
-    <w:bookmarkStart w:id="19" w:name="core-capabilities"/>
-    <w:p>
-      <w:pPr>
-        <w:pStyle w:val="Heading2"/>
-      </w:pPr>
-      <w:r>
-        <w:t xml:space="preserve">3. Core Capabilities</w:t>
-      </w:r>
-    </w:p>
-    <w:bookmarkStart w:id="14" w:name="Xd2fbb44096df71e58988262a999761abe847fda"/>
-    <w:p>
-      <w:pPr>
-        <w:pStyle w:val="Heading3"/>
-      </w:pPr>
-      <w:r>
-        <w:t xml:space="preserve">3.1. Sovereign Network Governance &amp; Telecommunications Compliance</w:t>
-      </w:r>
-    </w:p>
-    <w:p>
-      <w:pPr>
-        <w:pStyle w:val="Compact"/>
-        <w:numPr>
-          <w:ilvl w:val="0"/>
-          <w:numId w:val="1002"/>
-        </w:numPr>
-      </w:pPr>
-      <w:r>
-        <w:rPr>
-          <w:b/>
-          <w:bCs/>
-        </w:rPr>
-        <w:t xml:space="preserve">Underlay vs. Governance Overlay Separation:</w:t>
-      </w:r>
-      <w:r>
-        <w:t xml:space="preserve"> </w:t>
-      </w:r>
-      <w:r>
-        <w:t xml:space="preserve">Satellite and cellular underlays provide raw bandwidth, while the cryptographic WireGuard overlay forces all traffic to terminate inside licensed domestic carrier PoPs.</w:t>
-      </w:r>
-    </w:p>
-    <w:p>
-      <w:pPr>
-        <w:pStyle w:val="Compact"/>
-        <w:numPr>
-          <w:ilvl w:val="0"/>
-          <w:numId w:val="1002"/>
-        </w:numPr>
-      </w:pPr>
-      <w:r>
-        <w:rPr>
-          <w:b/>
-          <w:bCs/>
-        </w:rPr>
-        <w:t xml:space="preserve">National Sovereign IP Localization:</w:t>
-      </w:r>
-      <w:r>
-        <w:t xml:space="preserve"> </w:t>
-      </w:r>
-      <w:r>
-        <w:t xml:space="preserve">Enforces domestic breakout using registered national IP pools, preventing foreign CGNAT IP assignment from masking traffic origins.</w:t>
-      </w:r>
-    </w:p>
-    <w:p>
-      <w:pPr>
-        <w:pStyle w:val="Compact"/>
-        <w:numPr>
-          <w:ilvl w:val="0"/>
-          <w:numId w:val="1002"/>
-        </w:numPr>
-      </w:pPr>
-      <w:r>
-        <w:rPr>
-          <w:b/>
-          <w:bCs/>
-        </w:rPr>
-        <w:t xml:space="preserve">Regulatory Lawful Interception (ETSI / CALEA):</w:t>
-      </w:r>
-      <w:r>
-        <w:t xml:space="preserve"> </w:t>
-      </w:r>
-      <w:r>
-        <w:t xml:space="preserve">Enables lawful packet inspection, telecommunications tariff compliance, and security monitoring strictly at the sovereign PoP boundary.</w:t>
-      </w:r>
-    </w:p>
-    <w:p>
-      <w:pPr>
-        <w:pStyle w:val="Compact"/>
-        <w:numPr>
-          <w:ilvl w:val="0"/>
-          <w:numId w:val="1002"/>
-        </w:numPr>
-      </w:pPr>
-      <w:r>
-        <w:rPr>
-          <w:b/>
-          <w:bCs/>
-        </w:rPr>
-        <w:t xml:space="preserve">Multi-Framework Governance Auditing:</w:t>
-      </w:r>
-      <w:r>
-        <w:t xml:space="preserve"> </w:t>
-      </w:r>
-      <w:r>
-        <w:t xml:space="preserve">Real-time compliance verification for SOC 2 Type II, ISO 27001, PCI-DSS 4.0, and sovereign cross-border data protection acts via the cloud AI Compliance Hub (</w:t>
-      </w:r>
-      <w:hyperlink r:id="rId10">
-        <w:r>
-          <w:rPr>
-            <w:rStyle w:val="VerbatimChar"/>
-          </w:rPr>
-          <w:t xml:space="preserve">ai-compliance-web-five.vercel.app</w:t>
-        </w:r>
-      </w:hyperlink>
-      <w:r>
-        <w:t xml:space="preserve">).</w:t>
-      </w:r>
-    </w:p>
-    <w:bookmarkEnd w:id="14"/>
-    <w:bookmarkStart w:id="15" w:name="Xaf471fbbb20238b2fc782942a27b78111463112"/>
-    <w:p>
-      <w:pPr>
-        <w:pStyle w:val="Heading3"/>
-      </w:pPr>
-      <w:r>
-        <w:t xml:space="preserve">3.2. Zero-Data Production Mode &amp; Hardware Auto-Discovery</w:t>
-      </w:r>
-    </w:p>
-    <w:p>
-      <w:pPr>
-        <w:pStyle w:val="FirstParagraph"/>
-      </w:pPr>
-      <w:r>
-        <w:t xml:space="preserve">Unlike mock dashboards, V-Monitor operates in</w:t>
-      </w:r>
-      <w:r>
-        <w:t xml:space="preserve"> </w:t>
-      </w:r>
-      <w:r>
-        <w:rPr>
-          <w:b/>
-          <w:bCs/>
-        </w:rPr>
-        <w:t xml:space="preserve">Zero-Data Mode</w:t>
-      </w:r>
-      <w:r>
-        <w:t xml:space="preserve"> </w:t>
-      </w:r>
-      <w:r>
-        <w:t xml:space="preserve">by default. It discovers real network interfaces (</w:t>
-      </w:r>
-      <w:r>
-        <w:rPr>
-          <w:rStyle w:val="VerbatimChar"/>
-        </w:rPr>
-        <w:t xml:space="preserve">eno1</w:t>
-      </w:r>
-      <w:r>
-        <w:t xml:space="preserve">,</w:t>
-      </w:r>
-      <w:r>
-        <w:t xml:space="preserve"> </w:t>
-      </w:r>
-      <w:r>
-        <w:rPr>
-          <w:rStyle w:val="VerbatimChar"/>
-        </w:rPr>
-        <w:t xml:space="preserve">eth0</w:t>
-      </w:r>
-      <w:r>
-        <w:t xml:space="preserve">,</w:t>
-      </w:r>
-      <w:r>
-        <w:t xml:space="preserve"> </w:t>
-      </w:r>
-      <w:r>
-        <w:rPr>
-          <w:rStyle w:val="VerbatimChar"/>
-        </w:rPr>
-        <w:t xml:space="preserve">wg0</w:t>
-      </w:r>
-      <w:r>
-        <w:t xml:space="preserve">), maps live Layer-2 ARP neighbors, runs genuine ICMP echo diagnostics via</w:t>
-      </w:r>
-      <w:r>
-        <w:t xml:space="preserve"> </w:t>
-      </w:r>
-      <w:r>
-        <w:rPr>
-          <w:rStyle w:val="VerbatimChar"/>
-        </w:rPr>
-        <w:t xml:space="preserve">child_process.execFile</w:t>
-      </w:r>
-      <w:r>
-        <w:t xml:space="preserve">, and displays real hardware telemetry.</w:t>
-      </w:r>
-    </w:p>
-    <w:bookmarkEnd w:id="15"/>
-    <w:bookmarkStart w:id="16" w:name="sovereign-edge-mesh-multi-wan-bundling"/>
-    <w:p>
-      <w:pPr>
-        <w:pStyle w:val="Heading3"/>
-      </w:pPr>
-      <w:r>
-        <w:t xml:space="preserve">3.3. Sovereign Edge Mesh &amp; Multi-WAN Bundling</w:t>
-      </w:r>
-    </w:p>
-    <w:p>
-      <w:pPr>
-        <w:pStyle w:val="Compact"/>
-        <w:numPr>
-          <w:ilvl w:val="0"/>
-          <w:numId w:val="1003"/>
-        </w:numPr>
-      </w:pPr>
-      <w:r>
-        <w:rPr>
-          <w:b/>
-          <w:bCs/>
-        </w:rPr>
-        <w:t xml:space="preserve">Multi-Transport Aggregation:</w:t>
-      </w:r>
-      <w:r>
-        <w:t xml:space="preserve"> </w:t>
-      </w:r>
-      <w:r>
-        <w:t xml:space="preserve">Aggregates divergent physical transports (Dedicated Fiber DIA, Starlink LEO Satellite, Carrier Ethernet, and 5G cellular) into a single virtual tunnel.</w:t>
-      </w:r>
-    </w:p>
-    <w:p>
-      <w:pPr>
-        <w:pStyle w:val="Compact"/>
-        <w:numPr>
-          <w:ilvl w:val="0"/>
-          <w:numId w:val="1003"/>
-        </w:numPr>
-      </w:pPr>
-      <w:r>
-        <w:rPr>
-          <w:b/>
-          <w:bCs/>
-        </w:rPr>
-        <w:t xml:space="preserve">Sub-Second BFD Probing:</w:t>
-      </w:r>
-      <w:r>
-        <w:t xml:space="preserve"> </w:t>
-      </w:r>
-      <w:r>
-        <w:t xml:space="preserve">Continuous Bidirectional Forwarding Detection (1000ms down to 50ms) tracks roundtrip latency, packet loss, and jitter in real time.</w:t>
-      </w:r>
-    </w:p>
-    <w:p>
-      <w:pPr>
-        <w:pStyle w:val="Compact"/>
-        <w:numPr>
-          <w:ilvl w:val="0"/>
-          <w:numId w:val="1003"/>
-        </w:numPr>
-      </w:pPr>
-      <w:r>
-        <w:rPr>
-          <w:b/>
-          <w:bCs/>
-        </w:rPr>
-        <w:t xml:space="preserve">WireGuard Overlay:</w:t>
-      </w:r>
-      <w:r>
-        <w:t xml:space="preserve"> </w:t>
-      </w:r>
-      <w:r>
-        <w:t xml:space="preserve">Cryptographically isolated overlays powered by ChaCha20-Poly1305 and Curve25519 ECDH keypairs with autogenerated</w:t>
-      </w:r>
-      <w:r>
-        <w:t xml:space="preserve"> </w:t>
-      </w:r>
-      <w:r>
-        <w:rPr>
-          <w:rStyle w:val="VerbatimChar"/>
-        </w:rPr>
-        <w:t xml:space="preserve">/etc/wireguard/wg0.conf</w:t>
-      </w:r>
-      <w:r>
-        <w:t xml:space="preserve"> </w:t>
-      </w:r>
-      <w:r>
-        <w:t xml:space="preserve">profiles.</w:t>
-      </w:r>
-    </w:p>
-    <w:bookmarkEnd w:id="16"/>
-    <w:bookmarkStart w:id="17" w:name="autonomous-ai-noc-self-healing"/>
-    <w:p>
-      <w:pPr>
-        <w:pStyle w:val="Heading3"/>
-      </w:pPr>
-      <w:r>
-        <w:t xml:space="preserve">3.4. Autonomous AI-NOC &amp; Self-Healing</w:t>
-      </w:r>
-    </w:p>
-    <w:p>
-      <w:pPr>
-        <w:pStyle w:val="Compact"/>
-        <w:numPr>
-          <w:ilvl w:val="0"/>
-          <w:numId w:val="1004"/>
-        </w:numPr>
-      </w:pPr>
-      <w:r>
-        <w:rPr>
-          <w:b/>
-          <w:bCs/>
-        </w:rPr>
-        <w:t xml:space="preserve">Root Cause Analysis (RCA):</w:t>
-      </w:r>
-      <w:r>
-        <w:t xml:space="preserve"> </w:t>
-      </w:r>
-      <w:r>
-        <w:t xml:space="preserve">Automated diagnostic engine analyzes topological dependencies and telemetry to distinguish between physical fiber cuts, BGP route flaps, and carrier drops.</w:t>
-      </w:r>
-    </w:p>
-    <w:p>
-      <w:pPr>
-        <w:pStyle w:val="Compact"/>
-        <w:numPr>
-          <w:ilvl w:val="0"/>
-          <w:numId w:val="1004"/>
-        </w:numPr>
-      </w:pPr>
-      <w:r>
-        <w:rPr>
-          <w:b/>
-          <w:bCs/>
-        </w:rPr>
-        <w:t xml:space="preserve">Automated Remediation Playbooks:</w:t>
+        <w:t xml:space="preserve">Autonomous AI-NOC &amp; Self-Healing:</w:t>
       </w:r>
     </w:p>
     <w:p>
@@ -836,13 +466,56 @@
         </w:numPr>
       </w:pPr>
       <w:r>
+        <w:t xml:space="preserve">Automated Root Cause Analysis (RCA) diagnoses outages and executes playbooks (</w:t>
+      </w:r>
+      <w:r>
         <w:rPr>
           <w:rStyle w:val="VerbatimChar"/>
         </w:rPr>
         <w:t xml:space="preserve">AUTO_REMEDIATE</w:t>
       </w:r>
       <w:r>
-        <w:t xml:space="preserve">: Flushes stale ARP bindings, steers BGP route weights over secondary paths, and restores connectivity.</w:t>
+        <w:t xml:space="preserve">,</w:t>
+      </w:r>
+      <w:r>
+        <w:t xml:space="preserve"> </w:t>
+      </w:r>
+      <w:r>
+        <w:rPr>
+          <w:rStyle w:val="VerbatimChar"/>
+        </w:rPr>
+        <w:t xml:space="preserve">SWITCH_CARRIER</w:t>
+      </w:r>
+      <w:r>
+        <w:t xml:space="preserve">,</w:t>
+      </w:r>
+      <w:r>
+        <w:t xml:space="preserve"> </w:t>
+      </w:r>
+      <w:r>
+        <w:rPr>
+          <w:rStyle w:val="VerbatimChar"/>
+        </w:rPr>
+        <w:t xml:space="preserve">FLUSH_ARP_REBIND</w:t>
+      </w:r>
+      <w:r>
+        <w:t xml:space="preserve">).</w:t>
+      </w:r>
+    </w:p>
+    <w:p>
+      <w:pPr>
+        <w:pStyle w:val="Compact"/>
+        <w:numPr>
+          <w:ilvl w:val="0"/>
+          <w:numId w:val="1001"/>
+        </w:numPr>
+      </w:pPr>
+      <w:r>
+        <w:rPr>
+          <w:b/>
+          <w:bCs/>
+        </w:rPr>
+        <w:t xml:space="preserve">Operational Cockpit &amp; Remote VM Terminal:</w:t>
       </w:r>
     </w:p>
     <w:p>
@@ -850,89 +523,11 @@
         <w:pStyle w:val="Compact"/>
         <w:numPr>
           <w:ilvl w:val="1"/>
-          <w:numId w:val="1005"/>
-        </w:numPr>
-      </w:pPr>
-      <w:r>
-        <w:rPr>
-          <w:rStyle w:val="VerbatimChar"/>
-        </w:rPr>
-        <w:t xml:space="preserve">SWITCH_CARRIER</w:t>
-      </w:r>
-      <w:r>
-        <w:t xml:space="preserve">: Dynamically shifts traffic to backup Starlink LEO constellations during terrestrial fiber cuts.</w:t>
-      </w:r>
-    </w:p>
-    <w:p>
-      <w:pPr>
-        <w:pStyle w:val="Compact"/>
-        <w:numPr>
-          <w:ilvl w:val="1"/>
-          <w:numId w:val="1005"/>
-        </w:numPr>
-      </w:pPr>
-      <w:r>
-        <w:rPr>
-          <w:rStyle w:val="VerbatimChar"/>
-        </w:rPr>
-        <w:t xml:space="preserve">FLUSH_ARP_REBIND</w:t>
-      </w:r>
-      <w:r>
-        <w:t xml:space="preserve">: Clears stale kernel MAC tables directly on physical host interfaces.</w:t>
-      </w:r>
-    </w:p>
-    <w:bookmarkEnd w:id="17"/>
-    <w:bookmarkStart w:id="18" w:name="X64c05f3777aee276dec5a25f73084e74ff7619a"/>
-    <w:p>
-      <w:pPr>
-        <w:pStyle w:val="Heading3"/>
-      </w:pPr>
-      <w:r>
-        <w:t xml:space="preserve">3.5. 360° Operational Cockpit &amp; Interactive Web Terminal</w:t>
-      </w:r>
-    </w:p>
-    <w:p>
-      <w:pPr>
-        <w:pStyle w:val="Compact"/>
-        <w:numPr>
-          <w:ilvl w:val="0"/>
           <w:numId w:val="1006"/>
         </w:numPr>
       </w:pPr>
       <w:r>
-        <w:rPr>
-          <w:b/>
-          <w:bCs/>
-        </w:rPr>
-        <w:t xml:space="preserve">Site Cockpit Drawer:</w:t>
-      </w:r>
-      <w:r>
-        <w:t xml:space="preserve"> </w:t>
-      </w:r>
-      <w:r>
-        <w:t xml:space="preserve">Live inspection of active WAN uplinks, LAN subnets, connected nodes, appliance CPU/thermals, and 60-minute latency sparklines.</w:t>
-      </w:r>
-    </w:p>
-    <w:p>
-      <w:pPr>
-        <w:pStyle w:val="Compact"/>
-        <w:numPr>
-          <w:ilvl w:val="0"/>
-          <w:numId w:val="1006"/>
-        </w:numPr>
-      </w:pPr>
-      <w:r>
-        <w:rPr>
-          <w:b/>
-          <w:bCs/>
-        </w:rPr>
-        <w:t xml:space="preserve">Remote VM Shell:</w:t>
-      </w:r>
-      <w:r>
-        <w:t xml:space="preserve"> </w:t>
-      </w:r>
-      <w:r>
-        <w:t xml:space="preserve">Web-based interactive terminal providing authenticated command execution (</w:t>
+        <w:t xml:space="preserve">Live WAN/LAN inspection, SLA sparklines, and authenticated VM shell (</w:t>
       </w:r>
       <w:r>
         <w:rPr>
@@ -962,34 +557,10 @@
         <w:rPr>
           <w:rStyle w:val="VerbatimChar"/>
         </w:rPr>
-        <w:t xml:space="preserve">ip route</w:t>
-      </w:r>
-      <w:r>
-        <w:t xml:space="preserve">,</w:t>
-      </w:r>
-      <w:r>
-        <w:t xml:space="preserve"> </w:t>
-      </w:r>
-      <w:r>
-        <w:rPr>
-          <w:rStyle w:val="VerbatimChar"/>
-        </w:rPr>
-        <w:t xml:space="preserve">ss -tulpn</w:t>
-      </w:r>
-      <w:r>
-        <w:t xml:space="preserve">,</w:t>
-      </w:r>
-      <w:r>
-        <w:t xml:space="preserve"> </w:t>
-      </w:r>
-      <w:r>
-        <w:rPr>
-          <w:rStyle w:val="VerbatimChar"/>
-        </w:rPr>
-        <w:t xml:space="preserve">systemctl status</w:t>
-      </w:r>
-      <w:r>
-        <w:t xml:space="preserve">) directly on managed remote nodes.</w:t>
+        <w:t xml:space="preserve">systemctl</w:t>
+      </w:r>
+      <w:r>
+        <w:t xml:space="preserve">).</w:t>
       </w:r>
     </w:p>
     <w:p>
@@ -999,15 +570,14 @@
         </w:pict>
       </w:r>
     </w:p>
-    <w:bookmarkEnd w:id="18"/>
-    <w:bookmarkEnd w:id="19"/>
-    <w:bookmarkStart w:id="20" w:name="key-target-personas-use-cases"/>
+    <w:bookmarkEnd w:id="14"/>
+    <w:bookmarkStart w:id="15" w:name="key-personas-use-cases"/>
     <w:p>
       <w:pPr>
         <w:pStyle w:val="Heading2"/>
       </w:pPr>
       <w:r>
-        <w:t xml:space="preserve">4. Key Target Personas &amp; Use Cases</w:t>
+        <w:t xml:space="preserve">4. Key Personas &amp; Use Cases</w:t>
       </w:r>
     </w:p>
     <w:p>
@@ -1023,13 +593,13 @@
           <w:b/>
           <w:bCs/>
         </w:rPr>
-        <w:t xml:space="preserve">National Telecom Regulators &amp; Cyber Authorities:</w:t>
-      </w:r>
-      <w:r>
-        <w:t xml:space="preserve"> </w:t>
-      </w:r>
-      <w:r>
-        <w:t xml:space="preserve">Regulate enterprise LEO satellite deployments (Starlink) by mandating ICG compliance gateways to enforce lawful interception, security oversight, and domestic tax/tariff governance.</w:t>
+        <w:t xml:space="preserve">Telecom Regulators &amp; Authorities:</w:t>
+      </w:r>
+      <w:r>
+        <w:t xml:space="preserve"> </w:t>
+      </w:r>
+      <w:r>
+        <w:t xml:space="preserve">Enforce lawful interception, data residency, and tax compliance across satellite links.</w:t>
       </w:r>
     </w:p>
     <w:p>
@@ -1045,13 +615,13 @@
           <w:b/>
           <w:bCs/>
         </w:rPr>
-        <w:t xml:space="preserve">Tier-1 Telecom Carriers &amp; Domestic ISPs:</w:t>
-      </w:r>
-      <w:r>
-        <w:t xml:space="preserve"> </w:t>
-      </w:r>
-      <w:r>
-        <w:t xml:space="preserve">Monetize LEO satellite integration by providing domestic PoP termination, sovereign IP anchoring, and managed SLA failover to enterprise customers.</w:t>
+        <w:t xml:space="preserve">Tier-1 Telecom Carriers &amp; ISPs:</w:t>
+      </w:r>
+      <w:r>
+        <w:t xml:space="preserve"> </w:t>
+      </w:r>
+      <w:r>
+        <w:t xml:space="preserve">Monetize LEO satellite underlays via domestic PoP termination, sovereign IP anchoring, and enterprise SLAs.</w:t>
       </w:r>
     </w:p>
     <w:p>
@@ -1067,13 +637,13 @@
           <w:b/>
           <w:bCs/>
         </w:rPr>
-        <w:t xml:space="preserve">Banking &amp; Financial Institutions:</w:t>
-      </w:r>
-      <w:r>
-        <w:t xml:space="preserve"> </w:t>
-      </w:r>
-      <w:r>
-        <w:t xml:space="preserve">Guarantees sub-second failover for mission-critical SWIFT and POS transactions while strictly honoring financial data residency laws that forbid financial records from leaving national soil.</w:t>
+        <w:t xml:space="preserve">Banks &amp; Financial Institutions:</w:t>
+      </w:r>
+      <w:r>
+        <w:t xml:space="preserve"> </w:t>
+      </w:r>
+      <w:r>
+        <w:t xml:space="preserve">Guarantee sub-second failover for SWIFT/POS traffic while upholding financial data residency laws.</w:t>
       </w:r>
     </w:p>
     <w:p>
@@ -1089,13 +659,13 @@
           <w:b/>
           <w:bCs/>
         </w:rPr>
-        <w:t xml:space="preserve">Defense, Offshore &amp; Government Enclaves:</w:t>
-      </w:r>
-      <w:r>
-        <w:t xml:space="preserve"> </w:t>
-      </w:r>
-      <w:r>
-        <w:t xml:space="preserve">Hybrid WAN bonding pairs low-earth orbit (Starlink LEO) with 5G cellular to maintain uninterrupted, tamper-proof connectivity for remote tactical, mining, and maritime assets.</w:t>
+        <w:t xml:space="preserve">Defense &amp; Remote Operations:</w:t>
+      </w:r>
+      <w:r>
+        <w:t xml:space="preserve"> </w:t>
+      </w:r>
+      <w:r>
+        <w:t xml:space="preserve">Tamper-proof WAN bonding combining Starlink and 5G for remote enclaves.</w:t>
       </w:r>
     </w:p>
     <w:p>
@@ -1105,14 +675,14 @@
         </w:pict>
       </w:r>
     </w:p>
-    <w:bookmarkEnd w:id="20"/>
-    <w:bookmarkStart w:id="21" w:name="technology-stack"/>
+    <w:bookmarkEnd w:id="15"/>
+    <w:bookmarkStart w:id="16" w:name="technology-stack-quick-start"/>
     <w:p>
       <w:pPr>
         <w:pStyle w:val="Heading2"/>
       </w:pPr>
       <w:r>
-        <w:t xml:space="preserve">5. Technology Stack</w:t>
+        <w:t xml:space="preserve">5. Technology Stack &amp; Quick Start</w:t>
       </w:r>
     </w:p>
     <w:tbl>
@@ -1138,7 +708,7 @@
               <w:jc w:val="left"/>
             </w:pPr>
             <w:r>
-              <w:t xml:space="preserve">Component</w:t>
+              <w:t xml:space="preserve">Layer</w:t>
             </w:r>
           </w:p>
         </w:tc>
@@ -1168,7 +738,7 @@
                 <w:b/>
                 <w:bCs/>
               </w:rPr>
-              <w:t xml:space="preserve">Frontend Web NOC</w:t>
+              <w:t xml:space="preserve">Control Plane UI</w:t>
             </w:r>
           </w:p>
         </w:tc>
@@ -1180,7 +750,7 @@
               <w:jc w:val="left"/>
             </w:pPr>
             <w:r>
-              <w:t xml:space="preserve">Next.js 14, React 18, React Query (TanStack), Tailwind CSS, Lucide Icons</w:t>
+              <w:t xml:space="preserve">Next.js 14, React 18, TanStack Query, Tailwind CSS</w:t>
             </w:r>
           </w:p>
         </w:tc>
@@ -1198,7 +768,7 @@
                 <w:b/>
                 <w:bCs/>
               </w:rPr>
-              <w:t xml:space="preserve">Backend Core API</w:t>
+              <w:t xml:space="preserve">Core API &amp; DB</w:t>
             </w:r>
           </w:p>
         </w:tc>
@@ -1210,7 +780,7 @@
               <w:jc w:val="left"/>
             </w:pPr>
             <w:r>
-              <w:t xml:space="preserve">NestJS, TypeScript, TypeORM, Swagger/OpenAPI, Linux Netlink, eBPF</w:t>
+              <w:t xml:space="preserve">NestJS, TypeScript, TypeORM, MySQL 8, Redis, Netlink, eBPF</w:t>
             </w:r>
           </w:p>
         </w:tc>
@@ -1228,7 +798,7 @@
                 <w:b/>
                 <w:bCs/>
               </w:rPr>
-              <w:t xml:space="preserve">Database &amp; Cache</w:t>
+              <w:t xml:space="preserve">AI Engine &amp; Mesh</w:t>
             </w:r>
           </w:p>
         </w:tc>
@@ -1240,7 +810,7 @@
               <w:jc w:val="left"/>
             </w:pPr>
             <w:r>
-              <w:t xml:space="preserve">MySQL 8.0 / PostgreSQL, Redis Pub/Sub</w:t>
+              <w:t xml:space="preserve">FastAPI, Python 3.12, PyTorch, WireGuard, Linux BFD</w:t>
             </w:r>
           </w:p>
         </w:tc>
@@ -1258,7 +828,7 @@
                 <w:b/>
                 <w:bCs/>
               </w:rPr>
-              <w:t xml:space="preserve">AI Inference Engine</w:t>
+              <w:t xml:space="preserve">Cloud Deployments</w:t>
             </w:r>
           </w:p>
         </w:tc>
@@ -1269,121 +839,36 @@
               <w:pStyle w:val="Compact"/>
               <w:jc w:val="left"/>
             </w:pPr>
+            <w:hyperlink r:id="rId9">
+              <w:r>
+                <w:rPr>
+                  <w:rStyle w:val="Hyperlink"/>
+                </w:rPr>
+                <w:t xml:space="preserve">v-monitor.vercel.app</w:t>
+              </w:r>
+            </w:hyperlink>
             <w:r>
-              <w:t xml:space="preserve">FastAPI, Python 3.12, PyTorch/scikit-learn, httpx</w:t>
-            </w:r>
-          </w:p>
-        </w:tc>
-      </w:tr>
-      <w:tr>
-        <w:tc>
-          <w:tcPr/>
-          <w:p>
-            <w:pPr>
-              <w:pStyle w:val="Compact"/>
-              <w:jc w:val="left"/>
-            </w:pPr>
-            <w:r>
-              <w:rPr>
-                <w:b/>
-                <w:bCs/>
-              </w:rPr>
-              <w:t xml:space="preserve">Edge Networking</w:t>
-            </w:r>
-          </w:p>
-        </w:tc>
-        <w:tc>
-          <w:tcPr/>
-          <w:p>
-            <w:pPr>
-              <w:pStyle w:val="Compact"/>
-              <w:jc w:val="left"/>
-            </w:pPr>
-            <w:r>
-              <w:t xml:space="preserve">WireGuard (</w:t>
+              <w:t xml:space="preserve"> </w:t>
             </w:r>
             <w:r>
-              <w:rPr>
-                <w:rStyle w:val="VerbatimChar"/>
-              </w:rPr>
-              <w:t xml:space="preserve">wireguard.ko</w:t>
-            </w:r>
-            <w:r>
-              <w:t xml:space="preserve">), Linux</w:t>
+              <w:t xml:space="preserve">•</w:t>
             </w:r>
             <w:r>
               <w:t xml:space="preserve"> </w:t>
             </w:r>
-            <w:r>
-              <w:rPr>
-                <w:rStyle w:val="VerbatimChar"/>
-              </w:rPr>
-              <w:t xml:space="preserve">iproute2</w:t>
-            </w:r>
-            <w:r>
-              <w:t xml:space="preserve">, BFD, ChaCha20-Poly1305</w:t>
-            </w:r>
-          </w:p>
-        </w:tc>
-      </w:tr>
-      <w:tr>
-        <w:tc>
-          <w:tcPr/>
-          <w:p>
-            <w:pPr>
-              <w:pStyle w:val="Compact"/>
-              <w:jc w:val="left"/>
-            </w:pPr>
-            <w:r>
-              <w:rPr>
-                <w:b/>
-                <w:bCs/>
-              </w:rPr>
-              <w:t xml:space="preserve">Governance Cloud</w:t>
-            </w:r>
-          </w:p>
-        </w:tc>
-        <w:tc>
-          <w:tcPr/>
-          <w:p>
-            <w:pPr>
-              <w:pStyle w:val="Compact"/>
-              <w:jc w:val="left"/>
-            </w:pPr>
-            <w:r>
-              <w:t xml:space="preserve">Vercel Edge (</w:t>
-            </w:r>
-            <w:r>
-              <w:rPr>
-                <w:rStyle w:val="VerbatimChar"/>
-              </w:rPr>
-              <w:t xml:space="preserve">ai-compliance-web-five.vercel.app</w:t>
-            </w:r>
-            <w:r>
-              <w:t xml:space="preserve">), SOC 2, ISO 27001, ETSI</w:t>
-            </w:r>
+            <w:hyperlink r:id="rId10">
+              <w:r>
+                <w:rPr>
+                  <w:rStyle w:val="Hyperlink"/>
+                </w:rPr>
+                <w:t xml:space="preserve">ai-compliance-web-five.vercel.app</w:t>
+              </w:r>
+            </w:hyperlink>
           </w:p>
         </w:tc>
       </w:tr>
     </w:tbl>
     <w:p>
-      <w:r>
-        <w:pict>
-          <v:rect style="width:0;height:1.5pt" o:hralign="center" o:hrstd="t" o:hr="t"/>
-        </w:pict>
-      </w:r>
-    </w:p>
-    <w:bookmarkEnd w:id="21"/>
-    <w:bookmarkStart w:id="22" w:name="quick-start-verification"/>
-    <w:p>
-      <w:pPr>
-        <w:pStyle w:val="Heading2"/>
-      </w:pPr>
-      <w:r>
-        <w:t xml:space="preserve">6. Quick Start &amp; Verification</w:t>
-      </w:r>
-    </w:p>
-    <w:p>
       <w:pPr>
         <w:pStyle w:val="SourceCode"/>
       </w:pPr>
@@ -1391,7 +876,7 @@
         <w:rPr>
           <w:rStyle w:val="VerbatimChar"/>
         </w:rPr>
-        <w:t xml:space="preserve"># 1. Start all services (MySQL, API, Web NOC, AI Engine, Simulator)</w:t>
+        <w:t xml:space="preserve">./start-all.sh            # Launch MySQL, API (:3001), Web (:3000), AI (:8100)</w:t>
       </w:r>
       <w:r>
         <w:br/>
@@ -1400,92 +885,20 @@
         <w:rPr>
           <w:rStyle w:val="VerbatimChar"/>
         </w:rPr>
-        <w:t xml:space="preserve">./start-all.sh</w:t>
+        <w:t xml:space="preserve">./onboard-network.sh      # Discover and onboard physical network hardware</w:t>
       </w:r>
       <w:r>
         <w:br/>
       </w:r>
       <w:r>
-        <w:br/>
-      </w:r>
-      <w:r>
         <w:rPr>
           <w:rStyle w:val="VerbatimChar"/>
         </w:rPr>
-        <w:t xml:space="preserve"># 2. Check service health and port status</w:t>
-      </w:r>
-      <w:r>
-        <w:br/>
-      </w:r>
-      <w:r>
-        <w:rPr>
-          <w:rStyle w:val="VerbatimChar"/>
-        </w:rPr>
-        <w:t xml:space="preserve">./status.sh</w:t>
-      </w:r>
-      <w:r>
-        <w:br/>
-      </w:r>
-      <w:r>
-        <w:br/>
-      </w:r>
-      <w:r>
-        <w:rPr>
-          <w:rStyle w:val="VerbatimChar"/>
-        </w:rPr>
-        <w:t xml:space="preserve"># 3. Discover and onboard real physical network devices</w:t>
-      </w:r>
-      <w:r>
-        <w:br/>
-      </w:r>
-      <w:r>
-        <w:rPr>
-          <w:rStyle w:val="VerbatimChar"/>
-        </w:rPr>
-        <w:t xml:space="preserve">./onboard-network.sh</w:t>
-      </w:r>
-      <w:r>
-        <w:br/>
-      </w:r>
-      <w:r>
-        <w:br/>
-      </w:r>
-      <w:r>
-        <w:rPr>
-          <w:rStyle w:val="VerbatimChar"/>
-        </w:rPr>
-        <w:t xml:space="preserve"># 4. Access Web NOC Dashboard</w:t>
-      </w:r>
-      <w:r>
-        <w:br/>
-      </w:r>
-      <w:r>
-        <w:rPr>
-          <w:rStyle w:val="VerbatimChar"/>
-        </w:rPr>
-        <w:t xml:space="preserve"># Live Cloud NOC: https://v-monitor.vercel.app/</w:t>
-      </w:r>
-      <w:r>
-        <w:br/>
-      </w:r>
-      <w:r>
-        <w:rPr>
-          <w:rStyle w:val="VerbatimChar"/>
-        </w:rPr>
-        <w:t xml:space="preserve"># Local URL: http://localhost:3000 (or http://&lt;LAN_IP&gt;:3000)</w:t>
-      </w:r>
-      <w:r>
-        <w:br/>
-      </w:r>
-      <w:r>
-        <w:rPr>
-          <w:rStyle w:val="VerbatimChar"/>
-        </w:rPr>
-        <w:t xml:space="preserve"># Credentials: admin@intellilink.media / IntelliLink@2026</w:t>
-      </w:r>
-    </w:p>
-    <w:bookmarkEnd w:id="22"/>
-    <w:bookmarkEnd w:id="23"/>
+        <w:t xml:space="preserve">Credentials: admin@intellilink.media / IntelliLink@2026</w:t>
+      </w:r>
+    </w:p>
+    <w:bookmarkEnd w:id="16"/>
+    <w:bookmarkEnd w:id="17"/>
     <w:sectPr>
       <w:footnotePr>
         <w:numRestart w:val="eachSect"/>
@@ -1833,34 +1246,7 @@
     <w:abstractNumId w:val="991"/>
   </w:num>
   <w:num w:numId="1007">
-    <w:abstractNumId w:val="99411"/>
-    <w:lvlOverride w:ilvl="0">
-      <w:startOverride w:val="1"/>
-    </w:lvlOverride>
-    <w:lvlOverride w:ilvl="1">
-      <w:startOverride w:val="1"/>
-    </w:lvlOverride>
-    <w:lvlOverride w:ilvl="2">
-      <w:startOverride w:val="1"/>
-    </w:lvlOverride>
-    <w:lvlOverride w:ilvl="3">
-      <w:startOverride w:val="1"/>
-    </w:lvlOverride>
-    <w:lvlOverride w:ilvl="4">
-      <w:startOverride w:val="1"/>
-    </w:lvlOverride>
-    <w:lvlOverride w:ilvl="5">
-      <w:startOverride w:val="1"/>
-    </w:lvlOverride>
-    <w:lvlOverride w:ilvl="6">
-      <w:startOverride w:val="1"/>
-    </w:lvlOverride>
-    <w:lvlOverride w:ilvl="7">
-      <w:startOverride w:val="1"/>
-    </w:lvlOverride>
-    <w:lvlOverride w:ilvl="8">
-      <w:startOverride w:val="1"/>
-    </w:lvlOverride>
+    <w:abstractNumId w:val="991"/>
   </w:num>
 </w:numbering>
 </file>

</xml_diff>